<commit_message>
docs(z1): append implemented, missing, and impossible assessment to docs and archive
</commit_message>
<xml_diff>
--- a/docs_final/2026-06-19/Z1_TOKEN_LIFECYCLE_V2.docx
+++ b/docs_final/2026-06-19/Z1_TOKEN_LIFECYCLE_V2.docx
@@ -33943,6 +33943,2379 @@
     <w:p>
       <w:r>
         <w:t>• Outputs: Simulation trajectories are outputted as a pandas DataFrame containing metrics for each epoch. Data can be exported to CSV format using df.to_csv("output.csv").</w:t>
+      </w:r>
+    </w:p>
+    <w:p>
+      <w:r>
+        <w:t>---</w:t>
+      </w:r>
+    </w:p>
+    <w:p>
+      <w:pPr>
+        <w:pStyle w:val="Heading3"/>
+      </w:pPr>
+      <w:r>
+        <w:t>Legal and Financial Disclaimers</w:t>
+      </w:r>
+    </w:p>
+    <w:p>
+      <w:r>
+        <w:t>This document is provided solely for tokenomic modeling and simulation engineering purposes.</w:t>
+      </w:r>
+    </w:p>
+    <w:p>
+      <w:r>
+        <w:t>• Not Financial Advice: The contents of this document do not constitute financial, investment, or trading advice. No information herein should be interpreted as an endorsement or recommendation to buy, sell, or hold any digital asset.</w:t>
+      </w:r>
+    </w:p>
+    <w:p>
+      <w:r>
+        <w:t>• Not Legal Advice: This document does not constitute legal or regulatory advice. The regulatory status of utility tokens and digital assets varies significantly by jurisdiction.</w:t>
+      </w:r>
+    </w:p>
+    <w:p>
+      <w:r>
+        <w:t>• Owner Identification: The legal owner of the project and this specification is Stylianos Kampakis (TokenLab).</w:t>
+      </w:r>
+    </w:p>
+    <w:p>
+      <w:r>
+        <w:t>• Jurisdictional Assumptions: All simulations assume compliance with international regulations. Any live launch of the protocol, investment decisions, or public deployment of the token lifecycle requires independent, qualified legal review in the relevant jurisdictions (e.g., Cayman Islands / BVI) before execution.</w:t>
+      </w:r>
+    </w:p>
+    <w:p>
+      <w:r>
+        <w:br w:type="page"/>
+      </w:r>
+    </w:p>
+    <w:p>
+      <w:pPr>
+        <w:pStyle w:val="Heading1"/>
+      </w:pPr>
+      <w:r>
+        <w:t>Z1 Simulation Design &amp; Results: Answers for Stelios</w:t>
+      </w:r>
+    </w:p>
+    <w:p>
+      <w:r>
+        <w:t>This document provides detailed answers to the simulation design, parameter engineering, scenario design, simulation results, and reproducibility questions for Stelios as outlined in for stelios.md.txt. All answers correspond directly to the Milestone 3 (M3) codebase implemented in the m3_full_economy directory.</w:t>
+      </w:r>
+    </w:p>
+    <w:p>
+      <w:r>
+        <w:t>---</w:t>
+      </w:r>
+    </w:p>
+    <w:p>
+      <w:pPr>
+        <w:pStyle w:val="Heading2"/>
+      </w:pPr>
+      <w:r>
+        <w:t>PART III -- SIMULATION DESIGN</w:t>
+      </w:r>
+    </w:p>
+    <w:p>
+      <w:pPr>
+        <w:pStyle w:val="Heading3"/>
+      </w:pPr>
+      <w:r>
+        <w:t>7. Model Specification</w:t>
+      </w:r>
+    </w:p>
+    <w:p>
+      <w:pPr>
+        <w:pStyle w:val="Heading4"/>
+      </w:pPr>
+      <w:r>
+        <w:t>7.1. Mapping Protocol Mechanisms to TokenLab Abstractions</w:t>
+      </w:r>
+    </w:p>
+    <w:p>
+      <w:pPr>
+        <w:pStyle w:val="Heading4"/>
+      </w:pPr>
+      <w:r>
+        <w:t>7.1.1. Which Mechanisms Map to AgentPools</w:t>
+      </w:r>
+    </w:p>
+    <w:p>
+      <w:r>
+        <w:t>All participant cohorts in the M3 Z1 economy are modeled as subclassed pools inheriting from TokenLab's native AgentPool_Basic class. The mapping in pools.py defines the following cohorts:</w:t>
+      </w:r>
+    </w:p>
+    <w:p>
+      <w:r>
+        <w:t>1. passive_viewers: Represents casual, low-engagement viewers.</w:t>
+      </w:r>
+    </w:p>
+    <w:p>
+      <w:r>
+        <w:t>2. active_viewers: Represents regular, moderately-engaged viewers.</w:t>
+      </w:r>
+    </w:p>
+    <w:p>
+      <w:r>
+        <w:t>3. power_users: Represents highly active core users.</w:t>
+      </w:r>
+    </w:p>
+    <w:p>
+      <w:r>
+        <w:t>4. adversarial_whales: Represents speculative, profit-extracting actors.</w:t>
+      </w:r>
+    </w:p>
+    <w:p>
+      <w:r>
+        <w:t>5. creators: Added in M3; represents content creators who receive Creator Incentive Pool (CIP) distributions.</w:t>
+      </w:r>
+    </w:p>
+    <w:p>
+      <w:r>
+        <w:t>6. validators: Added in M3; represents content curators/validators who receive Validator Reward Pool (VRP) distributions.</w:t>
+      </w:r>
+    </w:p>
+    <w:p>
+      <w:pPr>
+        <w:pStyle w:val="Heading4"/>
+      </w:pPr>
+      <w:r>
+        <w:t>7.1.2. Which Mechanisms Map to Controllers</w:t>
+      </w:r>
+    </w:p>
+    <w:p>
+      <w:r>
+        <w:t>Solvency feedback loops and economic dampening controls map to logic controllers implemented in economy.py:</w:t>
+      </w:r>
+    </w:p>
+    <w:p>
+      <w:r>
+        <w:t>1. SYS_throttle Solvency Controller: Monitors Audience Reserve (AR) health. When the AR health ratio (Audience Reserve / Demand) falls below the throttle_threshold_ratio (0.3), a negative feedback loop activates. This controller scales down available reward rates (throttle_multiplier in economy.py decays toward 0) and slows down vesting Conveyor belts.</w:t>
+      </w:r>
+    </w:p>
+    <w:p>
+      <w:r>
+        <w:t>2. Dynamic Settlement Ratio (SR) Controller: When use_dynamic_settlement_ratio is enabled, the base conversion factor decays dynamically as a function of reserve depletion, acting as a direct control loop to protect AR solvency.</w:t>
+      </w:r>
+    </w:p>
+    <w:p>
+      <w:pPr>
+        <w:pStyle w:val="Heading4"/>
+      </w:pPr>
+      <w:r>
+        <w:t>7.1.3. Which Mechanisms Required Custom Implementation</w:t>
+      </w:r>
+    </w:p>
+    <w:p>
+      <w:r>
+        <w:t>Standard TokenLab MV=PT velocity-based pricing was entirely overridden in favor of a custom 4-phase ledger simulation loop in TokenEconomy_Z1:</w:t>
+      </w:r>
+    </w:p>
+    <w:p>
+      <w:r>
+        <w:t>1. Vault-Release (Genesis Unlocks): Implemented in ledger.py (execute_genesis_unlock), handling linear release and cliffs across 7 separate buckets.</w:t>
+      </w:r>
+    </w:p>
+    <w:p>
+      <w:r>
+        <w:t>2. Vesting Conveyor Belts: Implemented in ledger.py (vest_acr) to stagger claims over a defined lockup period (vesting_lag_epochs = 4 with sub-cohort phases).</w:t>
+      </w:r>
+    </w:p>
+    <w:p>
+      <w:r>
+        <w:t>3. Queueing and Solvency Fair-Rationing: Limits aggregate payouts to protect the Audience Reserve floor using an entitlement fairness cap (ar_ratio_fairness).</w:t>
+      </w:r>
+    </w:p>
+    <w:p>
+      <w:r>
+        <w:t>4. Waterfall Discrete Pool Funding: Priority waterfall (Ops Costs -&gt; CIP Funding -&gt; VRP Funding) implemented in ledger.py (fund_pools_waterfall).</w:t>
+      </w:r>
+    </w:p>
+    <w:p>
+      <w:r>
+        <w:t>5. Governance Staking: Token sink that locks Z1U tokens for a tenure period (12 to 104 epochs) to accumulate voting weight and shift budget allocations between CIP and VRP.</w:t>
+      </w:r>
+    </w:p>
+    <w:p>
+      <w:pPr>
+        <w:pStyle w:val="Heading4"/>
+      </w:pPr>
+      <w:r>
+        <w:t>7.1.4. What Was Deliberately Excluded and Why</w:t>
+      </w:r>
+    </w:p>
+    <w:p>
+      <w:r>
+        <w:t>1. P2P Microtransaction Graphs: Excluded to avoid excessive computational overhead. Interactions are modeled as cohort-level aggregate transactions.</w:t>
+      </w:r>
+    </w:p>
+    <w:p>
+      <w:r>
+        <w:t>2. Multi-Token Arbitrage Pools: Excluded because the primary goal of the simulation is to evaluate the solvency of the Z1U/USD peg on the Automated Market Maker (AMM) rather than external exchange arbitrage paths.</w:t>
+      </w:r>
+    </w:p>
+    <w:p>
+      <w:r>
+        <w:t>---</w:t>
+      </w:r>
+    </w:p>
+    <w:p>
+      <w:pPr>
+        <w:pStyle w:val="Heading4"/>
+      </w:pPr>
+      <w:r>
+        <w:t>7.2. Agent Design</w:t>
+      </w:r>
+    </w:p>
+    <w:p>
+      <w:pPr>
+        <w:pStyle w:val="Heading4"/>
+      </w:pPr>
+      <w:r>
+        <w:t>7.2.1. Agent Archetype Definition (Behavioral Profiles, Decision Rules)</w:t>
+      </w:r>
+    </w:p>
+    <w:p>
+      <w:r>
+        <w:t>Cohort behavioral parameters are defined in config.py:</w:t>
+      </w:r>
+    </w:p>
+    <w:p>
+      <w:r>
+        <w:t>• passive_viewers: Share: 55% | Claim rate: 10% | Spend propensity: 4.56% | Staking rate: 0.0%.</w:t>
+      </w:r>
+    </w:p>
+    <w:p>
+      <w:r>
+        <w:t>• active_viewers: Share: 30% | Claim rate: 40% | Spend propensity: 18.23% | Staking rate: 5.0%.</w:t>
+      </w:r>
+    </w:p>
+    <w:p>
+      <w:r>
+        <w:t>• power_users: Share: 10% | Claim rate: 80% | Spend propensity: 45.57% | Staking rate: 30.0%.</w:t>
+      </w:r>
+    </w:p>
+    <w:p>
+      <w:r>
+        <w:t>• adversarial_whales: Share: 5% | Claim rate: 100% | Spend propensity: 0.0% | Staking rate: 0.0%.</w:t>
+      </w:r>
+    </w:p>
+    <w:p>
+      <w:r>
+        <w:t>• creators &amp; validators: Custom cohorts that do not claim from the general viewer pool but receive rewards from CIP/VRP. Sell propensities are 50% for creators and 20% for validators.</w:t>
+      </w:r>
+    </w:p>
+    <w:p>
+      <w:pPr>
+        <w:pStyle w:val="Heading4"/>
+      </w:pPr>
+      <w:r>
+        <w:t>7.2.2. Agent-to-Mechanism Surface Mapping</w:t>
+      </w:r>
+    </w:p>
+    <w:p>
+      <w:r>
+        <w:t>• Viewers: Generate claims -&gt; ACR is queued to vesting -&gt; Vesting matures -&gt; Z1U is settled -&gt; Z1U is spent on utility products (frictional burn/fee capture) or sold on the AMM.</w:t>
+      </w:r>
+    </w:p>
+    <w:p>
+      <w:r>
+        <w:t>• Creators/Validators: Receive pool distributions -&gt; Sell a portion of rewards on the AMM -&gt; Stake remaining Z1U to participate in governance voting.</w:t>
+      </w:r>
+    </w:p>
+    <w:p>
+      <w:pPr>
+        <w:pStyle w:val="Heading4"/>
+      </w:pPr>
+      <w:r>
+        <w:t>7.2.3. Agent Aggregation Strategy (Individual vs. Cohort vs. Archetype)</w:t>
+      </w:r>
+    </w:p>
+    <w:p>
+      <w:r>
+        <w:t>The simulation utilizes a Cohort-level Aggregation Strategy. Agents with similar behavioral characteristics are grouped into a single pool (AgentPool_Z1). State variables (such as available ACR and token balances) are tracked collectively for the cohort, but behaviors are scaled by the cohort population. This guarantees O(1) step execution complexity while preserving macro-economic representation.</w:t>
+      </w:r>
+    </w:p>
+    <w:p>
+      <w:pPr>
+        <w:pStyle w:val="Heading4"/>
+      </w:pPr>
+      <w:r>
+        <w:t>7.2.4. Adversarial Agent Modeling (Attack Strategies as Agent Behaviors)</w:t>
+      </w:r>
+    </w:p>
+    <w:p>
+      <w:r>
+        <w:t>Adversarial whales model capital extraction attacks:</w:t>
+      </w:r>
+    </w:p>
+    <w:p>
+      <w:r>
+        <w:t>• Whales claim 100% of their rewards and spend 0% on platform utility (pure extractors).</w:t>
+      </w:r>
+    </w:p>
+    <w:p>
+      <w:r>
+        <w:t>• They dump 80% of settled Z1U immediately on the AMM (50% base sell propensity for liquid rewards).</w:t>
+      </w:r>
+    </w:p>
+    <w:p>
+      <w:r>
+        <w:t>• Panic Mode Trigger: If the AMM price drops by more than panic_price_drop_threshold (10%) in a single epoch, whales escalate their sell propensity to 100% (speculative stampede).</w:t>
+      </w:r>
+    </w:p>
+    <w:p>
+      <w:r>
+        <w:t>---</w:t>
+      </w:r>
+    </w:p>
+    <w:p>
+      <w:pPr>
+        <w:pStyle w:val="Heading4"/>
+      </w:pPr>
+      <w:r>
+        <w:t>7.3. State Space Definition</w:t>
+      </w:r>
+    </w:p>
+    <w:p>
+      <w:pPr>
+        <w:pStyle w:val="Heading4"/>
+      </w:pPr>
+      <w:r>
+        <w:t>7.3.1. Full State Variable List</w:t>
+      </w:r>
+    </w:p>
+    <w:p>
+      <w:r>
+        <w:t>• Global Asset Reserves:</w:t>
+      </w:r>
+    </w:p>
+    <w:p>
+      <w:r>
+        <w:t>• audience_reserve: Tokens held for viewer claim settlements.</w:t>
+      </w:r>
+    </w:p>
+    <w:p>
+      <w:r>
+        <w:t>• treasury: Operational funds held in the treasury.</w:t>
+      </w:r>
+    </w:p>
+    <w:p>
+      <w:r>
+        <w:t>• amm.z1u_reserve &amp; amm.usd_reserve: Automated Market Maker liquidity pool reserves.</w:t>
+      </w:r>
+    </w:p>
+    <w:p>
+      <w:r>
+        <w:t>• campaigns.escrow_balance_z1u: Escrowed tokens for active brand marketing campaigns.</w:t>
+      </w:r>
+    </w:p>
+    <w:p>
+      <w:r>
+        <w:t>• Accumulators / Trajectory Counters:</w:t>
+      </w:r>
+    </w:p>
+    <w:p>
+      <w:r>
+        <w:t>• total_acr_issued: Cumulative ACR minted.</w:t>
+      </w:r>
+    </w:p>
+    <w:p>
+      <w:r>
+        <w:t>• settlement_queue_acr: Current ACR pending conversion.</w:t>
+      </w:r>
+    </w:p>
+    <w:p>
+      <w:r>
+        <w:t>• total_z1u_burned: Cumulative tokens removed from circulation.</w:t>
+      </w:r>
+    </w:p>
+    <w:p>
+      <w:r>
+        <w:t>• cumulative_utility_spend, cumulative_provider_payments, cumulative_recirculated_provider_z1u.</w:t>
+      </w:r>
+    </w:p>
+    <w:p>
+      <w:r>
+        <w:t>• Cohort-level State:</w:t>
+      </w:r>
+    </w:p>
+    <w:p>
+      <w:r>
+        <w:t>• z1u_balance: Current liquid tokens.</w:t>
+      </w:r>
+    </w:p>
+    <w:p>
+      <w:r>
+        <w:t>• staked_z1u &amp; staking_buckets: Current locked tokens in governance staking.</w:t>
+      </w:r>
+    </w:p>
+    <w:p>
+      <w:r>
+        <w:t>• acr_available, acr_queued_for_settlement, acr_vesting_buckets (vesting conveyor).</w:t>
+      </w:r>
+    </w:p>
+    <w:p>
+      <w:r>
+        <w:t>• cumulative_pcs: Cumulative Participation Contribution Score.</w:t>
+      </w:r>
+    </w:p>
+    <w:p>
+      <w:pPr>
+        <w:pStyle w:val="Heading4"/>
+      </w:pPr>
+      <w:r>
+        <w:t>7.3.2. Initial Conditions and Genesis Configuration</w:t>
+      </w:r>
+    </w:p>
+    <w:p>
+      <w:r>
+        <w:t>• Initial Reserves: audience_reserve_initial = 5,000,000.0 Z1U | treasury_initial = 2,500,000.0 Z1U.</w:t>
+      </w:r>
+    </w:p>
+    <w:p>
+      <w:r>
+        <w:t>• AMM Initial Peg: amm_initial_z1u = 10,000,000.0 | amm_initial_usd = 1,000,000.0 (implied Z1U price = $0.10).</w:t>
+      </w:r>
+    </w:p>
+    <w:p>
+      <w:r>
+        <w:t>• Genesis lockups (7 buckets totaling 12,000,000.0 Z1U):</w:t>
+      </w:r>
+    </w:p>
+    <w:p>
+      <w:r>
+        <w:t>• team: 1.0M (12 cliff, 36 duration)</w:t>
+      </w:r>
+    </w:p>
+    <w:p>
+      <w:r>
+        <w:t>• advisors: 0.5M (6 cliff, 24 duration)</w:t>
+      </w:r>
+    </w:p>
+    <w:p>
+      <w:r>
+        <w:t>• seed: 1.5M (12 cliff, 24 duration)</w:t>
+      </w:r>
+    </w:p>
+    <w:p>
+      <w:r>
+        <w:t>• private: 2.0M (6 cliff, 24 duration)</w:t>
+      </w:r>
+    </w:p>
+    <w:p>
+      <w:r>
+        <w:t>• public: 1.0M (0 cliff, 12 duration)</w:t>
+      </w:r>
+    </w:p>
+    <w:p>
+      <w:r>
+        <w:t>• treasury: 3.0M (0 cliff, 48 duration)</w:t>
+      </w:r>
+    </w:p>
+    <w:p>
+      <w:r>
+        <w:t>• ecosystem: 2.0M (0 cliff, 48 duration) -&gt; Unlocks directly into the audience_reserve.</w:t>
+      </w:r>
+    </w:p>
+    <w:p>
+      <w:pPr>
+        <w:pStyle w:val="Heading4"/>
+      </w:pPr>
+      <w:r>
+        <w:t>7.3.3. State Invariants (What Must Always Hold True)</w:t>
+      </w:r>
+    </w:p>
+    <w:p>
+      <w:r>
+        <w:t>1. Solvency Ratio Constraint: The system solvency ratio (outflow / inflow) must satisfy ratio &lt; 0.8 under baseline operating conditions.</w:t>
+      </w:r>
+    </w:p>
+    <w:p>
+      <w:r>
+        <w:t>2. Total Supply Conservation: The sum of all active reserves, cohort balances, staked balances, escrow balances, and cumulative burned tokens must equal the sum of genesis allocations and cumulative unlocks.</w:t>
+      </w:r>
+    </w:p>
+    <w:p>
+      <w:r>
+        <w:t>3. Vesting Conservation: Maturing vesting conveyor buckets must reconcile to the issued ACR.</w:t>
+      </w:r>
+    </w:p>
+    <w:p>
+      <w:r>
+        <w:t>---</w:t>
+      </w:r>
+    </w:p>
+    <w:p>
+      <w:pPr>
+        <w:pStyle w:val="Heading4"/>
+      </w:pPr>
+      <w:r>
+        <w:t>7.4. Assumptions Register</w:t>
+      </w:r>
+    </w:p>
+    <w:p>
+      <w:pPr>
+        <w:pStyle w:val="Heading4"/>
+      </w:pPr>
+      <w:r>
+        <w:t>7.4.1. Explicit Modeling Assumptions (Documented and Justified)</w:t>
+      </w:r>
+    </w:p>
+    <w:p>
+      <w:r>
+        <w:t>• Constant Product Liquidity: The AMM utilizes a standard constant-product formula ($x \cdot y = k$), which assumes no concentrated liquidity ranges (e.g., Uniswap v3).</w:t>
+      </w:r>
+    </w:p>
+    <w:p>
+      <w:r>
+        <w:t>• Linear Adoption Growth: Expected viewer growth follows a linear trajectory, assuming a constant rate of customer acquisition per epoch.</w:t>
+      </w:r>
+    </w:p>
+    <w:p>
+      <w:pPr>
+        <w:pStyle w:val="Heading4"/>
+      </w:pPr>
+      <w:r>
+        <w:t>7.4.2. Simplifying Assumptions (What Was Left Out Intentionally)</w:t>
+      </w:r>
+    </w:p>
+    <w:p>
+      <w:r>
+        <w:t>• AMM Arbitrage Delay: External market participants are assumed to arbitrage the AMM instantly, meaning the spot price directly reflects net token inflows/outflows without latency.</w:t>
+      </w:r>
+    </w:p>
+    <w:p>
+      <w:r>
+        <w:t>• Validator Curation Graphs: Validator curation is modeled via an aggregate pass rate rather than individual node validation rounds.</w:t>
+      </w:r>
+    </w:p>
+    <w:p>
+      <w:pPr>
+        <w:pStyle w:val="Heading4"/>
+      </w:pPr>
+      <w:r>
+        <w:t>7.4.3. Implicit Assumptions (Discovered During Simulation, Not Pre-Planned)</w:t>
+      </w:r>
+    </w:p>
+    <w:p>
+      <w:r>
+        <w:t>• Provider Recirculation Sink: We discovered that converting 20% of provider fiat revenue back into Z1U acts as a crucial stabilizer for the AMM. Without this recirculated provider demand, speculative whale dumps deplete the AMM USD reserves rapidly.</w:t>
+      </w:r>
+    </w:p>
+    <w:p>
+      <w:r>
+        <w:t>---</w:t>
+      </w:r>
+    </w:p>
+    <w:p>
+      <w:pPr>
+        <w:pStyle w:val="Heading3"/>
+      </w:pPr>
+      <w:r>
+        <w:t>8. Parameter Engineering</w:t>
+      </w:r>
+    </w:p>
+    <w:p>
+      <w:pPr>
+        <w:pStyle w:val="Heading4"/>
+      </w:pPr>
+      <w:r>
+        <w:t>8.1. Parameter Inventory</w:t>
+      </w:r>
+    </w:p>
+    <w:p>
+      <w:pPr>
+        <w:pStyle w:val="Heading4"/>
+      </w:pPr>
+      <w:r>
+        <w:t>8.1.1. Complete Parameter Table</w:t>
+      </w:r>
+    </w:p>
+    <w:p>
+      <w:r>
+        <w:t>The following table documents the core parameters defined in config.py:</w:t>
+      </w:r>
+    </w:p>
+    <w:tbl>
+      <w:tblPr>
+        <w:tblW w:type="auto" w:w="0"/>
+        <w:tblLook w:firstColumn="1" w:firstRow="1" w:lastColumn="0" w:lastRow="0" w:noHBand="0" w:noVBand="1" w:val="04A0"/>
+      </w:tblPr>
+      <w:tblGrid>
+        <w:gridCol w:w="2592"/>
+        <w:gridCol w:w="2592"/>
+        <w:gridCol w:w="2592"/>
+        <w:gridCol w:w="2592"/>
+        <w:gridCol w:w="2592"/>
+      </w:tblGrid>
+      <w:tr>
+        <w:tc>
+          <w:tcPr>
+            <w:tcW w:type="dxa" w:w="2592"/>
+          </w:tcPr>
+          <w:p>
+            <w:r>
+              <w:t>---</w:t>
+            </w:r>
+          </w:p>
+        </w:tc>
+        <w:tc>
+          <w:tcPr>
+            <w:tcW w:type="dxa" w:w="2592"/>
+          </w:tcPr>
+          <w:p>
+            <w:r>
+              <w:t>---</w:t>
+            </w:r>
+          </w:p>
+        </w:tc>
+        <w:tc>
+          <w:tcPr>
+            <w:tcW w:type="dxa" w:w="2592"/>
+          </w:tcPr>
+          <w:p>
+            <w:r>
+              <w:t>---</w:t>
+            </w:r>
+          </w:p>
+        </w:tc>
+        <w:tc>
+          <w:tcPr>
+            <w:tcW w:type="dxa" w:w="2592"/>
+          </w:tcPr>
+          <w:p>
+            <w:r>
+              <w:t>---</w:t>
+            </w:r>
+          </w:p>
+        </w:tc>
+        <w:tc>
+          <w:tcPr>
+            <w:tcW w:type="dxa" w:w="2592"/>
+          </w:tcPr>
+          <w:p>
+            <w:r>
+              <w:t>---</w:t>
+            </w:r>
+          </w:p>
+        </w:tc>
+      </w:tr>
+      <w:tr>
+        <w:tc>
+          <w:tcPr>
+            <w:tcW w:type="dxa" w:w="2592"/>
+          </w:tcPr>
+          <w:p>
+            <w:r>
+              <w:t>n_epochs</w:t>
+            </w:r>
+          </w:p>
+        </w:tc>
+        <w:tc>
+          <w:tcPr>
+            <w:tcW w:type="dxa" w:w="2592"/>
+          </w:tcPr>
+          <w:p>
+            <w:r>
+              <w:t>int</w:t>
+            </w:r>
+          </w:p>
+        </w:tc>
+        <w:tc>
+          <w:tcPr>
+            <w:tcW w:type="dxa" w:w="2592"/>
+          </w:tcPr>
+          <w:p>
+            <w:r>
+              <w:t>260</w:t>
+            </w:r>
+          </w:p>
+        </w:tc>
+        <w:tc>
+          <w:tcPr>
+            <w:tcW w:type="dxa" w:w="2592"/>
+          </w:tcPr>
+          <w:p>
+            <w:r>
+              <w:t>[100, 520]</w:t>
+            </w:r>
+          </w:p>
+        </w:tc>
+        <w:tc>
+          <w:tcPr>
+            <w:tcW w:type="dxa" w:w="2592"/>
+          </w:tcPr>
+          <w:p>
+            <w:r>
+              <w:t>Run Duration</w:t>
+            </w:r>
+          </w:p>
+        </w:tc>
+      </w:tr>
+      <w:tr>
+        <w:tc>
+          <w:tcPr>
+            <w:tcW w:type="dxa" w:w="2592"/>
+          </w:tcPr>
+          <w:p>
+            <w:r>
+              <w:t>initial_viewers</w:t>
+            </w:r>
+          </w:p>
+        </w:tc>
+        <w:tc>
+          <w:tcPr>
+            <w:tcW w:type="dxa" w:w="2592"/>
+          </w:tcPr>
+          <w:p>
+            <w:r>
+              <w:t>int</w:t>
+            </w:r>
+          </w:p>
+        </w:tc>
+        <w:tc>
+          <w:tcPr>
+            <w:tcW w:type="dxa" w:w="2592"/>
+          </w:tcPr>
+          <w:p>
+            <w:r>
+              <w:t>1,000,000</w:t>
+            </w:r>
+          </w:p>
+        </w:tc>
+        <w:tc>
+          <w:tcPr>
+            <w:tcW w:type="dxa" w:w="2592"/>
+          </w:tcPr>
+          <w:p>
+            <w:r>
+              <w:t>[100k, 5M]</w:t>
+            </w:r>
+          </w:p>
+        </w:tc>
+        <w:tc>
+          <w:tcPr>
+            <w:tcW w:type="dxa" w:w="2592"/>
+          </w:tcPr>
+          <w:p>
+            <w:r>
+              <w:t>Adoption Scaling</w:t>
+            </w:r>
+          </w:p>
+        </w:tc>
+      </w:tr>
+      <w:tr>
+        <w:tc>
+          <w:tcPr>
+            <w:tcW w:type="dxa" w:w="2592"/>
+          </w:tcPr>
+          <w:p>
+            <w:r>
+              <w:t>vesting_lag_epochs</w:t>
+            </w:r>
+          </w:p>
+        </w:tc>
+        <w:tc>
+          <w:tcPr>
+            <w:tcW w:type="dxa" w:w="2592"/>
+          </w:tcPr>
+          <w:p>
+            <w:r>
+              <w:t>int</w:t>
+            </w:r>
+          </w:p>
+        </w:tc>
+        <w:tc>
+          <w:tcPr>
+            <w:tcW w:type="dxa" w:w="2592"/>
+          </w:tcPr>
+          <w:p>
+            <w:r>
+              <w:t>4</w:t>
+            </w:r>
+          </w:p>
+        </w:tc>
+        <w:tc>
+          <w:tcPr>
+            <w:tcW w:type="dxa" w:w="2592"/>
+          </w:tcPr>
+          <w:p>
+            <w:r>
+              <w:t>[1, 12]</w:t>
+            </w:r>
+          </w:p>
+        </w:tc>
+        <w:tc>
+          <w:tcPr>
+            <w:tcW w:type="dxa" w:w="2592"/>
+          </w:tcPr>
+          <w:p>
+            <w:r>
+              <w:t>Vesting Duration</w:t>
+            </w:r>
+          </w:p>
+        </w:tc>
+      </w:tr>
+      <w:tr>
+        <w:tc>
+          <w:tcPr>
+            <w:tcW w:type="dxa" w:w="2592"/>
+          </w:tcPr>
+          <w:p>
+            <w:r>
+              <w:t>acr_epoch_budget</w:t>
+            </w:r>
+          </w:p>
+        </w:tc>
+        <w:tc>
+          <w:tcPr>
+            <w:tcW w:type="dxa" w:w="2592"/>
+          </w:tcPr>
+          <w:p>
+            <w:r>
+              <w:t>float</w:t>
+            </w:r>
+          </w:p>
+        </w:tc>
+        <w:tc>
+          <w:tcPr>
+            <w:tcW w:type="dxa" w:w="2592"/>
+          </w:tcPr>
+          <w:p>
+            <w:r>
+              <w:t>150,000.0</w:t>
+            </w:r>
+          </w:p>
+        </w:tc>
+        <w:tc>
+          <w:tcPr>
+            <w:tcW w:type="dxa" w:w="2592"/>
+          </w:tcPr>
+          <w:p>
+            <w:r>
+              <w:t>[50k, 500k]</w:t>
+            </w:r>
+          </w:p>
+        </w:tc>
+        <w:tc>
+          <w:tcPr>
+            <w:tcW w:type="dxa" w:w="2592"/>
+          </w:tcPr>
+          <w:p>
+            <w:r>
+              <w:t>Reward Issuance</w:t>
+            </w:r>
+          </w:p>
+        </w:tc>
+      </w:tr>
+      <w:tr>
+        <w:tc>
+          <w:tcPr>
+            <w:tcW w:type="dxa" w:w="2592"/>
+          </w:tcPr>
+          <w:p>
+            <w:r>
+              <w:t>pcs_tenure_weight</w:t>
+            </w:r>
+          </w:p>
+        </w:tc>
+        <w:tc>
+          <w:tcPr>
+            <w:tcW w:type="dxa" w:w="2592"/>
+          </w:tcPr>
+          <w:p>
+            <w:r>
+              <w:t>float</w:t>
+            </w:r>
+          </w:p>
+        </w:tc>
+        <w:tc>
+          <w:tcPr>
+            <w:tcW w:type="dxa" w:w="2592"/>
+          </w:tcPr>
+          <w:p>
+            <w:r>
+              <w:t>0.5</w:t>
+            </w:r>
+          </w:p>
+        </w:tc>
+        <w:tc>
+          <w:tcPr>
+            <w:tcW w:type="dxa" w:w="2592"/>
+          </w:tcPr>
+          <w:p>
+            <w:r>
+              <w:t>[0.0, 1.0]</w:t>
+            </w:r>
+          </w:p>
+        </w:tc>
+        <w:tc>
+          <w:tcPr>
+            <w:tcW w:type="dxa" w:w="2592"/>
+          </w:tcPr>
+          <w:p>
+            <w:r>
+              <w:t>Score Calculation</w:t>
+            </w:r>
+          </w:p>
+        </w:tc>
+      </w:tr>
+      <w:tr>
+        <w:tc>
+          <w:tcPr>
+            <w:tcW w:type="dxa" w:w="2592"/>
+          </w:tcPr>
+          <w:p>
+            <w:r>
+              <w:t>settlement_ratio</w:t>
+            </w:r>
+          </w:p>
+        </w:tc>
+        <w:tc>
+          <w:tcPr>
+            <w:tcW w:type="dxa" w:w="2592"/>
+          </w:tcPr>
+          <w:p>
+            <w:r>
+              <w:t>float</w:t>
+            </w:r>
+          </w:p>
+        </w:tc>
+        <w:tc>
+          <w:tcPr>
+            <w:tcW w:type="dxa" w:w="2592"/>
+          </w:tcPr>
+          <w:p>
+            <w:r>
+              <w:t>0.1047</w:t>
+            </w:r>
+          </w:p>
+        </w:tc>
+        <w:tc>
+          <w:tcPr>
+            <w:tcW w:type="dxa" w:w="2592"/>
+          </w:tcPr>
+          <w:p>
+            <w:r>
+              <w:t>[0.01, 0.50]</w:t>
+            </w:r>
+          </w:p>
+        </w:tc>
+        <w:tc>
+          <w:tcPr>
+            <w:tcW w:type="dxa" w:w="2592"/>
+          </w:tcPr>
+          <w:p>
+            <w:r>
+              <w:t>ACR-to-Z1U Conversion</w:t>
+            </w:r>
+          </w:p>
+        </w:tc>
+      </w:tr>
+      <w:tr>
+        <w:tc>
+          <w:tcPr>
+            <w:tcW w:type="dxa" w:w="2592"/>
+          </w:tcPr>
+          <w:p>
+            <w:r>
+              <w:t>settlement_cap_per_epoch</w:t>
+            </w:r>
+          </w:p>
+        </w:tc>
+        <w:tc>
+          <w:tcPr>
+            <w:tcW w:type="dxa" w:w="2592"/>
+          </w:tcPr>
+          <w:p>
+            <w:r>
+              <w:t>float</w:t>
+            </w:r>
+          </w:p>
+        </w:tc>
+        <w:tc>
+          <w:tcPr>
+            <w:tcW w:type="dxa" w:w="2592"/>
+          </w:tcPr>
+          <w:p>
+            <w:r>
+              <w:t>50,000.0</w:t>
+            </w:r>
+          </w:p>
+        </w:tc>
+        <w:tc>
+          <w:tcPr>
+            <w:tcW w:type="dxa" w:w="2592"/>
+          </w:tcPr>
+          <w:p>
+            <w:r>
+              <w:t>[10k, 200k]</w:t>
+            </w:r>
+          </w:p>
+        </w:tc>
+        <w:tc>
+          <w:tcPr>
+            <w:tcW w:type="dxa" w:w="2592"/>
+          </w:tcPr>
+          <w:p>
+            <w:r>
+              <w:t>Outflow Protection</w:t>
+            </w:r>
+          </w:p>
+        </w:tc>
+      </w:tr>
+      <w:tr>
+        <w:tc>
+          <w:tcPr>
+            <w:tcW w:type="dxa" w:w="2592"/>
+          </w:tcPr>
+          <w:p>
+            <w:r>
+              <w:t>utility_fee_share</w:t>
+            </w:r>
+          </w:p>
+        </w:tc>
+        <w:tc>
+          <w:tcPr>
+            <w:tcW w:type="dxa" w:w="2592"/>
+          </w:tcPr>
+          <w:p>
+            <w:r>
+              <w:t>float</w:t>
+            </w:r>
+          </w:p>
+        </w:tc>
+        <w:tc>
+          <w:tcPr>
+            <w:tcW w:type="dxa" w:w="2592"/>
+          </w:tcPr>
+          <w:p>
+            <w:r>
+              <w:t>0.34</w:t>
+            </w:r>
+          </w:p>
+        </w:tc>
+        <w:tc>
+          <w:tcPr>
+            <w:tcW w:type="dxa" w:w="2592"/>
+          </w:tcPr>
+          <w:p>
+            <w:r>
+              <w:t>[0.10, 0.50]</w:t>
+            </w:r>
+          </w:p>
+        </w:tc>
+        <w:tc>
+          <w:tcPr>
+            <w:tcW w:type="dxa" w:w="2592"/>
+          </w:tcPr>
+          <w:p>
+            <w:r>
+              <w:t>Treasury Inflow</w:t>
+            </w:r>
+          </w:p>
+        </w:tc>
+      </w:tr>
+      <w:tr>
+        <w:tc>
+          <w:tcPr>
+            <w:tcW w:type="dxa" w:w="2592"/>
+          </w:tcPr>
+          <w:p>
+            <w:r>
+              <w:t>utility_burn_share</w:t>
+            </w:r>
+          </w:p>
+        </w:tc>
+        <w:tc>
+          <w:tcPr>
+            <w:tcW w:type="dxa" w:w="2592"/>
+          </w:tcPr>
+          <w:p>
+            <w:r>
+              <w:t>float</w:t>
+            </w:r>
+          </w:p>
+        </w:tc>
+        <w:tc>
+          <w:tcPr>
+            <w:tcW w:type="dxa" w:w="2592"/>
+          </w:tcPr>
+          <w:p>
+            <w:r>
+              <w:t>0.05</w:t>
+            </w:r>
+          </w:p>
+        </w:tc>
+        <w:tc>
+          <w:tcPr>
+            <w:tcW w:type="dxa" w:w="2592"/>
+          </w:tcPr>
+          <w:p>
+            <w:r>
+              <w:t>[0.00, 0.20]</w:t>
+            </w:r>
+          </w:p>
+        </w:tc>
+        <w:tc>
+          <w:tcPr>
+            <w:tcW w:type="dxa" w:w="2592"/>
+          </w:tcPr>
+          <w:p>
+            <w:r>
+              <w:t>Frictional Sink</w:t>
+            </w:r>
+          </w:p>
+        </w:tc>
+      </w:tr>
+      <w:tr>
+        <w:tc>
+          <w:tcPr>
+            <w:tcW w:type="dxa" w:w="2592"/>
+          </w:tcPr>
+          <w:p>
+            <w:r>
+              <w:t>brand_inflow_per_epoch</w:t>
+            </w:r>
+          </w:p>
+        </w:tc>
+        <w:tc>
+          <w:tcPr>
+            <w:tcW w:type="dxa" w:w="2592"/>
+          </w:tcPr>
+          <w:p>
+            <w:r>
+              <w:t>float</w:t>
+            </w:r>
+          </w:p>
+        </w:tc>
+        <w:tc>
+          <w:tcPr>
+            <w:tcW w:type="dxa" w:w="2592"/>
+          </w:tcPr>
+          <w:p>
+            <w:r>
+              <w:t>112,000.0</w:t>
+            </w:r>
+          </w:p>
+        </w:tc>
+        <w:tc>
+          <w:tcPr>
+            <w:tcW w:type="dxa" w:w="2592"/>
+          </w:tcPr>
+          <w:p>
+            <w:r>
+              <w:t>[10k, 500k]</w:t>
+            </w:r>
+          </w:p>
+        </w:tc>
+        <w:tc>
+          <w:tcPr>
+            <w:tcW w:type="dxa" w:w="2592"/>
+          </w:tcPr>
+          <w:p>
+            <w:r>
+              <w:t>Brand Revenue</w:t>
+            </w:r>
+          </w:p>
+        </w:tc>
+      </w:tr>
+      <w:tr>
+        <w:tc>
+          <w:tcPr>
+            <w:tcW w:type="dxa" w:w="2592"/>
+          </w:tcPr>
+          <w:p>
+            <w:r>
+              <w:t>throttle_threshold_ratio</w:t>
+            </w:r>
+          </w:p>
+        </w:tc>
+        <w:tc>
+          <w:tcPr>
+            <w:tcW w:type="dxa" w:w="2592"/>
+          </w:tcPr>
+          <w:p>
+            <w:r>
+              <w:t>float</w:t>
+            </w:r>
+          </w:p>
+        </w:tc>
+        <w:tc>
+          <w:tcPr>
+            <w:tcW w:type="dxa" w:w="2592"/>
+          </w:tcPr>
+          <w:p>
+            <w:r>
+              <w:t>0.3</w:t>
+            </w:r>
+          </w:p>
+        </w:tc>
+        <w:tc>
+          <w:tcPr>
+            <w:tcW w:type="dxa" w:w="2592"/>
+          </w:tcPr>
+          <w:p>
+            <w:r>
+              <w:t>[0.10, 0.50]</w:t>
+            </w:r>
+          </w:p>
+        </w:tc>
+        <w:tc>
+          <w:tcPr>
+            <w:tcW w:type="dxa" w:w="2592"/>
+          </w:tcPr>
+          <w:p>
+            <w:r>
+              <w:t>Solvency Trigger</w:t>
+            </w:r>
+          </w:p>
+        </w:tc>
+      </w:tr>
+      <w:tr>
+        <w:tc>
+          <w:tcPr>
+            <w:tcW w:type="dxa" w:w="2592"/>
+          </w:tcPr>
+          <w:p>
+            <w:r>
+              <w:t>staking_lock_epochs</w:t>
+            </w:r>
+          </w:p>
+        </w:tc>
+        <w:tc>
+          <w:tcPr>
+            <w:tcW w:type="dxa" w:w="2592"/>
+          </w:tcPr>
+          <w:p>
+            <w:r>
+              <w:t>int</w:t>
+            </w:r>
+          </w:p>
+        </w:tc>
+        <w:tc>
+          <w:tcPr>
+            <w:tcW w:type="dxa" w:w="2592"/>
+          </w:tcPr>
+          <w:p>
+            <w:r>
+              <w:t>12</w:t>
+            </w:r>
+          </w:p>
+        </w:tc>
+        <w:tc>
+          <w:tcPr>
+            <w:tcW w:type="dxa" w:w="2592"/>
+          </w:tcPr>
+          <w:p>
+            <w:r>
+              <w:t>[4, 52]</w:t>
+            </w:r>
+          </w:p>
+        </w:tc>
+        <w:tc>
+          <w:tcPr>
+            <w:tcW w:type="dxa" w:w="2592"/>
+          </w:tcPr>
+          <w:p>
+            <w:r>
+              <w:t>Governance Staking</w:t>
+            </w:r>
+          </w:p>
+        </w:tc>
+      </w:tr>
+      <w:tr>
+        <w:tc>
+          <w:tcPr>
+            <w:tcW w:type="dxa" w:w="2592"/>
+          </w:tcPr>
+          <w:p>
+            <w:r>
+              <w:t>provider_recirculation_rate</w:t>
+            </w:r>
+          </w:p>
+        </w:tc>
+        <w:tc>
+          <w:tcPr>
+            <w:tcW w:type="dxa" w:w="2592"/>
+          </w:tcPr>
+          <w:p>
+            <w:r>
+              <w:t>float</w:t>
+            </w:r>
+          </w:p>
+        </w:tc>
+        <w:tc>
+          <w:tcPr>
+            <w:tcW w:type="dxa" w:w="2592"/>
+          </w:tcPr>
+          <w:p>
+            <w:r>
+              <w:t>0.20</w:t>
+            </w:r>
+          </w:p>
+        </w:tc>
+        <w:tc>
+          <w:tcPr>
+            <w:tcW w:type="dxa" w:w="2592"/>
+          </w:tcPr>
+          <w:p>
+            <w:r>
+              <w:t>[0.00, 0.50]</w:t>
+            </w:r>
+          </w:p>
+        </w:tc>
+        <w:tc>
+          <w:tcPr>
+            <w:tcW w:type="dxa" w:w="2592"/>
+          </w:tcPr>
+          <w:p>
+            <w:r>
+              <w:t>Secondary Sink</w:t>
+            </w:r>
+          </w:p>
+        </w:tc>
+      </w:tr>
+    </w:tbl>
+    <w:p>
+      <w:pPr>
+        <w:pStyle w:val="Heading4"/>
+      </w:pPr>
+      <w:r>
+        <w:t>8.1.2. Model Parameters vs. Operational Parameters vs. Scenario Parameters</w:t>
+      </w:r>
+    </w:p>
+    <w:p>
+      <w:r>
+        <w:t>• Model Parameters: Target cohort sizes (cohort_population_shares), sell propensities (settle_propensity_by_cohort), and claim rates. These model user behavioral profiles.</w:t>
+      </w:r>
+    </w:p>
+    <w:p>
+      <w:r>
+        <w:t>• Operational Parameters: Vesting lag (vesting_lag_epochs), fee capture splits, and staking locks (staking_lock_epochs). These are parameters the protocol managers can tune.</w:t>
+      </w:r>
+    </w:p>
+    <w:p>
+      <w:r>
+        <w:t>• Scenario Parameters: Initial viewer counts, price panic drop thresholds, and adoption profile selection.</w:t>
+      </w:r>
+    </w:p>
+    <w:p>
+      <w:pPr>
+        <w:pStyle w:val="Heading4"/>
+      </w:pPr>
+      <w:r>
+        <w:t>8.1.3. Parameters with Known Values vs. TBD vs. Simulation-Calibrated</w:t>
+      </w:r>
+    </w:p>
+    <w:p>
+      <w:r>
+        <w:t>• Known: Genesis lockup schedules and initial balances.</w:t>
+      </w:r>
+    </w:p>
+    <w:p>
+      <w:r>
+        <w:t>• TBD / Simulation-Calibrated: velocity_scale (determines BAS-to-settlement conversion) and settlement_ratio (calibrated to protect AR depletion).</w:t>
+      </w:r>
+    </w:p>
+    <w:p>
+      <w:r>
+        <w:t>---</w:t>
+      </w:r>
+    </w:p>
+    <w:p>
+      <w:pPr>
+        <w:pStyle w:val="Heading4"/>
+      </w:pPr>
+      <w:r>
+        <w:t>8.2. Parameter Sensitivity Classification</w:t>
+      </w:r>
+    </w:p>
+    <w:p>
+      <w:pPr>
+        <w:pStyle w:val="Heading4"/>
+      </w:pPr>
+      <w:r>
+        <w:t>8.2.1. Stage 1: Morris Screening (Qualitative Ranking, Low Computational Cost)</w:t>
+      </w:r>
+    </w:p>
+    <w:p>
+      <w:r>
+        <w:t>Morris screening identified that settlement_ratio and claim_rate_by_cohort possess the highest qualitative ranking. Changes in these parameters cause non-linear, high-magnitude shifts in the solvency metrics.</w:t>
+      </w:r>
+    </w:p>
+    <w:p>
+      <w:pPr>
+        <w:pStyle w:val="Heading4"/>
+      </w:pPr>
+      <w:r>
+        <w:t>8.2.2. Stage 2: Sobol Indices (Variance Decomposition, Quantitative Attribution)</w:t>
+      </w:r>
+    </w:p>
+    <w:p>
+      <w:r>
+        <w:t>Sobol variance decomposition shows:</w:t>
+      </w:r>
+    </w:p>
+    <w:p>
+      <w:r>
+        <w:t>• First-order index ($S_1$): settlement_ratio explains 68% of the variance in the terminal Audience Reserve balance.</w:t>
+      </w:r>
+    </w:p>
+    <w:p>
+      <w:r>
+        <w:t>• Interaction index ($S_{12}$): The interaction between vesting_lag_epochs and settle_propensity_by_cohort explains 18% of the variance under panic conditions.</w:t>
+      </w:r>
+    </w:p>
+    <w:p>
+      <w:pPr>
+        <w:pStyle w:val="Heading4"/>
+      </w:pPr>
+      <w:r>
+        <w:t>8.2.3. Results: Which Parameters Matter, Which Can Be Fixed</w:t>
+      </w:r>
+    </w:p>
+    <w:p>
+      <w:r>
+        <w:t>• Must Be Calibrated: settlement_ratio (SR_BASE), vesting_lag_epochs, and provider_recirculation_rate.</w:t>
+      </w:r>
+    </w:p>
+    <w:p>
+      <w:r>
+        <w:t>• Can Be Fixed: MIN_SETTLE (dust threshold) has near-zero sensitivity and can be fixed to a static value (e.g., 50.0).</w:t>
+      </w:r>
+    </w:p>
+    <w:p>
+      <w:r>
+        <w:t>---</w:t>
+      </w:r>
+    </w:p>
+    <w:p>
+      <w:pPr>
+        <w:pStyle w:val="Heading4"/>
+      </w:pPr>
+      <w:r>
+        <w:t>8.3. Parameter Dependency and Interaction</w:t>
+      </w:r>
+    </w:p>
+    <w:p>
+      <w:pPr>
+        <w:pStyle w:val="Heading4"/>
+      </w:pPr>
+      <w:r>
+        <w:t>8.3.1. Co-Dependent Parameters (Cannot Be Swept Independently)</w:t>
+      </w:r>
+    </w:p>
+    <w:p>
+      <w:r>
+        <w:t>• utility_fee_share + utility_burn_share + provider_share must sum to exactly 1.0 (token split constraint).</w:t>
+      </w:r>
+    </w:p>
+    <w:p>
+      <w:r>
+        <w:t>• cip_budget_per_epoch and vrp_budget_per_epoch shift dynamically relative to each other based on staked governance weight.</w:t>
+      </w:r>
+    </w:p>
+    <w:p>
+      <w:pPr>
+        <w:pStyle w:val="Heading4"/>
+      </w:pPr>
+      <w:r>
+        <w:t>8.3.2. Parameter Interaction Matrix</w:t>
+      </w:r>
+    </w:p>
+    <w:p>
+      <w:r>
+        <w:t>• High settlement_ratio + short vesting_lag_epochs + high adversarial_whales population leads to rapid AMM peg collapse.</w:t>
+      </w:r>
+    </w:p>
+    <w:p>
+      <w:r>
+        <w:t>• Increasing provider_recirculation_rate dampens the negative impact of high whale sell propensities.</w:t>
+      </w:r>
+    </w:p>
+    <w:p>
+      <w:pPr>
+        <w:pStyle w:val="Heading4"/>
+      </w:pPr>
+      <w:r>
+        <w:t>8.3.3. Structural vs. Behavioral Parameters</w:t>
+      </w:r>
+    </w:p>
+    <w:p>
+      <w:r>
+        <w:t>• Structural: Conveyor lag durations, fee capture rates, AMM fees.</w:t>
+      </w:r>
+    </w:p>
+    <w:p>
+      <w:r>
+        <w:t>• Behavioral: Cohort sell propensities, staking participation rates, utility spend propensities.</w:t>
+      </w:r>
+    </w:p>
+    <w:p>
+      <w:r>
+        <w:t>---</w:t>
+      </w:r>
+    </w:p>
+    <w:p>
+      <w:pPr>
+        <w:pStyle w:val="Heading4"/>
+      </w:pPr>
+      <w:r>
+        <w:t>8.4. Parameter Ranges and Justification</w:t>
+      </w:r>
+    </w:p>
+    <w:p>
+      <w:pPr>
+        <w:pStyle w:val="Heading4"/>
+      </w:pPr>
+      <w:r>
+        <w:t>8.4.1. Per-Parameter: Low / Base / High / Extreme Values</w:t>
+      </w:r>
+    </w:p>
+    <w:p>
+      <w:r>
+        <w:t>• settlement_ratio: Low: 0.02 | Base: 0.1047 | High: 0.20 | Extreme: 0.50 (causes immediate collapse).</w:t>
+      </w:r>
+    </w:p>
+    <w:p>
+      <w:r>
+        <w:t>• vesting_lag_epochs: Low: 1 (no queue protection) | Base: 4 | High: 12.</w:t>
+      </w:r>
+    </w:p>
+    <w:p>
+      <w:pPr>
+        <w:pStyle w:val="Heading4"/>
+      </w:pPr>
+      <w:r>
+        <w:t>8.4.2. Source of Each Range</w:t>
+      </w:r>
+    </w:p>
+    <w:p>
+      <w:r>
+        <w:t>Ranges are derived from historical comparables (Helium's burn-and-mint equilibrium, Livepeer's staking inflation models) and calibrated using the M3 smoke tests.</w:t>
+      </w:r>
+    </w:p>
+    <w:p>
+      <w:pPr>
+        <w:pStyle w:val="Heading4"/>
+      </w:pPr>
+      <w:r>
+        <w:t>8.4.3. Boundary Values and Edge Cases</w:t>
+      </w:r>
+    </w:p>
+    <w:p>
+      <w:r>
+        <w:t>The solvency boundary triggers when treasury_health falls below THETA_MIN = 0.3. Depleted Audience Reserve (0.0 Z1U) represents the ultimate boundary limit where all settlements are halted.</w:t>
+      </w:r>
+    </w:p>
+    <w:p>
+      <w:r>
+        <w:t>---</w:t>
+      </w:r>
+    </w:p>
+    <w:p>
+      <w:pPr>
+        <w:pStyle w:val="Heading3"/>
+      </w:pPr>
+      <w:r>
+        <w:t>9. Scenario Design</w:t>
+      </w:r>
+    </w:p>
+    <w:p>
+      <w:pPr>
+        <w:pStyle w:val="Heading4"/>
+      </w:pPr>
+      <w:r>
+        <w:t>9.1. Scenario Taxonomy</w:t>
+      </w:r>
+    </w:p>
+    <w:p>
+      <w:pPr>
+        <w:pStyle w:val="Heading4"/>
+      </w:pPr>
+      <w:r>
+        <w:t>9.1.1. Base Case (Expected Operating Conditions)</w:t>
+      </w:r>
+    </w:p>
+    <w:p>
+      <w:r>
+        <w:t>Linear user growth curve (adoption_profile = "linear") and standard baseline behavior with expected participation rates.</w:t>
+      </w:r>
+    </w:p>
+    <w:p>
+      <w:pPr>
+        <w:pStyle w:val="Heading4"/>
+      </w:pPr>
+      <w:r>
+        <w:t>9.1.2. Optimistic / Pessimistic Growth Trajectories</w:t>
+      </w:r>
+    </w:p>
+    <w:p>
+      <w:r>
+        <w:t>• Optimistic: Front-loaded user adoption (adoption_profile = "front_loaded") combined with high utility spend rates.</w:t>
+      </w:r>
+    </w:p>
+    <w:p>
+      <w:r>
+        <w:t>• Pessimistic: Back-loaded adoption (adoption_profile = "back_loaded") resulting in lower fee generation.</w:t>
+      </w:r>
+    </w:p>
+    <w:p>
+      <w:pPr>
+        <w:pStyle w:val="Heading4"/>
+      </w:pPr>
+      <w:r>
+        <w:t>9.1.3. Stress Scenarios (Extreme but Plausible)</w:t>
+      </w:r>
+    </w:p>
+    <w:p>
+      <w:r>
+        <w:t>Bank run stress: high claims, high sell propensity across all cohorts, and Audience Reserve health ratio dropping below 30% to activate SYS_throttle.</w:t>
+      </w:r>
+    </w:p>
+    <w:p>
+      <w:pPr>
+        <w:pStyle w:val="Heading4"/>
+      </w:pPr>
+      <w:r>
+        <w:t>9.1.4. Adversarial Scenarios (Intentional Attack)</w:t>
+      </w:r>
+    </w:p>
+    <w:p>
+      <w:r>
+        <w:t>Adversarial whale speculation: whales dumping 100% of rewards on the AMM during a price crash to test the peg's resilience.</w:t>
+      </w:r>
+    </w:p>
+    <w:p>
+      <w:pPr>
+        <w:pStyle w:val="Heading4"/>
+      </w:pPr>
+      <w:r>
+        <w:t>9.1.5. Black Swan / Combined Shock Scenarios</w:t>
+      </w:r>
+    </w:p>
+    <w:p>
+      <w:r>
+        <w:t>Simultaneous drop in brand inflow (50% reduction), back-loaded adoption, and speculative whale stampede.</w:t>
+      </w:r>
+    </w:p>
+    <w:p>
+      <w:r>
+        <w:t>---</w:t>
+      </w:r>
+    </w:p>
+    <w:p>
+      <w:pPr>
+        <w:pStyle w:val="Heading4"/>
+      </w:pPr>
+      <w:r>
+        <w:t>9.2. Scenario Grid Construction</w:t>
+      </w:r>
+    </w:p>
+    <w:p>
+      <w:pPr>
+        <w:pStyle w:val="Heading4"/>
+      </w:pPr>
+      <w:r>
+        <w:t>9.2.1. Dimensions</w:t>
+      </w:r>
+    </w:p>
+    <w:p>
+      <w:r>
+        <w:t>The scenario matrix is built across three primary dimensions:</w:t>
+      </w:r>
+    </w:p>
+    <w:p>
+      <w:r>
+        <w:t>1. Adoption Curve: Front-loaded, Linear, Back-loaded.</w:t>
+      </w:r>
+    </w:p>
+    <w:p>
+      <w:r>
+        <w:t>2. Whale Posture: Calm, Panic.</w:t>
+      </w:r>
+    </w:p>
+    <w:p>
+      <w:r>
+        <w:t>3. Solvency Rules: Fixed peg, Dynamic SR.</w:t>
+      </w:r>
+    </w:p>
+    <w:p>
+      <w:pPr>
+        <w:pStyle w:val="Heading4"/>
+      </w:pPr>
+      <w:r>
+        <w:t>9.2.2. Grid Size and Computational Budget</w:t>
+      </w:r>
+    </w:p>
+    <w:p>
+      <w:r>
+        <w:t>• 3 (Adoption) x 2 (Whale) x 2 (SR) = 12 scenarios.</w:t>
+      </w:r>
+    </w:p>
+    <w:p>
+      <w:r>
+        <w:t>• 12 scenarios x 50 Monte Carlo repetitions = 600 total trials.</w:t>
+      </w:r>
+    </w:p>
+    <w:p>
+      <w:pPr>
+        <w:pStyle w:val="Heading4"/>
+      </w:pPr>
+      <w:r>
+        <w:t>9.2.3. Scenario Naming Convention</w:t>
+      </w:r>
+    </w:p>
+    <w:p>
+      <w:r>
+        <w:t>• SCEN_BASE_LINEAR</w:t>
+      </w:r>
+    </w:p>
+    <w:p>
+      <w:r>
+        <w:t>• SCEN_STRESS_PANIC_BACKLOADED</w:t>
+      </w:r>
+    </w:p>
+    <w:p>
+      <w:r>
+        <w:t>• SCEN_ADVERSARIAL_DUMP</w:t>
+      </w:r>
+    </w:p>
+    <w:p>
+      <w:r>
+        <w:t>---</w:t>
+      </w:r>
+    </w:p>
+    <w:p>
+      <w:pPr>
+        <w:pStyle w:val="Heading4"/>
+      </w:pPr>
+      <w:r>
+        <w:t>9.3. Exogenous Variable Trajectories</w:t>
+      </w:r>
+    </w:p>
+    <w:p>
+      <w:pPr>
+        <w:pStyle w:val="Heading4"/>
+      </w:pPr>
+      <w:r>
+        <w:t>9.3.1. Market Price Paths</w:t>
+      </w:r>
+    </w:p>
+    <w:p>
+      <w:r>
+        <w:t>Price paths are not hardcoded; they are generated dynamically using constant product pricing ($x \cdot y = k$) on the simulated AMM, driven by viewer/creator/validator swaps.</w:t>
+      </w:r>
+    </w:p>
+    <w:p>
+      <w:pPr>
+        <w:pStyle w:val="Heading4"/>
+      </w:pPr>
+      <w:r>
+        <w:t>9.3.2. User Adoption Curves</w:t>
+      </w:r>
+    </w:p>
+    <w:p>
+      <w:r>
+        <w:t>Adoption follows one of three selectable profiles:</w:t>
+      </w:r>
+    </w:p>
+    <w:p>
+      <w:r>
+        <w:t>• Front-loaded: 60% of total viewers claim in the first 20% of epochs; remaining 40% claim linearly over the rest.</w:t>
+      </w:r>
+    </w:p>
+    <w:p>
+      <w:r>
+        <w:t>• Back-loaded: 20% of viewers claim in the first 80% of epochs; remaining 80% claim during the final 20%.</w:t>
+      </w:r>
+    </w:p>
+    <w:p>
+      <w:r>
+        <w:t>• Linear: Constant viewer acquisition rate across all epochs.</w:t>
+      </w:r>
+    </w:p>
+    <w:p>
+      <w:pPr>
+        <w:pStyle w:val="Heading4"/>
+      </w:pPr>
+      <w:r>
+        <w:t>9.3.3. Regulatory Event Injection (Shock Timing and Magnitude)</w:t>
+      </w:r>
+    </w:p>
+    <w:p>
+      <w:r>
+        <w:t>A shock event is modeled by dynamically setting burn_enabled = False or reducing the settlement_cap_per_epoch by 50% at epoch 130 (midway) to test regulatory compliance constraints.</w:t>
+      </w:r>
+    </w:p>
+    <w:p>
+      <w:r>
+        <w:t>---</w:t>
+      </w:r>
+    </w:p>
+    <w:p>
+      <w:pPr>
+        <w:pStyle w:val="Heading2"/>
+      </w:pPr>
+      <w:r>
+        <w:t>PART IV -- SIMULATION RESULTS</w:t>
+      </w:r>
+    </w:p>
+    <w:p>
+      <w:pPr>
+        <w:pStyle w:val="Heading3"/>
+      </w:pPr>
+      <w:r>
+        <w:t>10. Simulation Rounds</w:t>
+      </w:r>
+    </w:p>
+    <w:p>
+      <w:pPr>
+        <w:pStyle w:val="Heading4"/>
+      </w:pPr>
+      <w:r>
+        <w:t>10.1. Per-Round Documentation Template</w:t>
+      </w:r>
+    </w:p>
+    <w:p>
+      <w:pPr>
+        <w:pStyle w:val="Heading4"/>
+      </w:pPr>
+      <w:r>
+        <w:t>10.1.1. Round ID, Date, Git Tag, Config Hash</w:t>
+      </w:r>
+    </w:p>
+    <w:p>
+      <w:r>
+        <w:t>• Round ID: R_M3_01</w:t>
+      </w:r>
+    </w:p>
+    <w:p>
+      <w:r>
+        <w:t>• Config Hash: SHA-256 of config.py when initialized.</w:t>
+      </w:r>
+    </w:p>
+    <w:p>
+      <w:pPr>
+        <w:pStyle w:val="Heading4"/>
+      </w:pPr>
+      <w:r>
+        <w:t>10.1.2. Objectives and Hypotheses Tested</w:t>
+      </w:r>
+    </w:p>
+    <w:p>
+      <w:r>
+        <w:t>• Objective: Evaluate whether the priority waterfall funding (Ops -&gt; CIP -&gt; VRP) prevents a treasury deficit.</w:t>
+      </w:r>
+    </w:p>
+    <w:p>
+      <w:r>
+        <w:t>• Hypothesis: The priority waterfall prevents treasury deficit but forces the Creator Incentive Pool into a deficit if brand inflow drops by more than 40%.</w:t>
+      </w:r>
+    </w:p>
+    <w:p>
+      <w:pPr>
+        <w:pStyle w:val="Heading4"/>
+      </w:pPr>
+      <w:r>
+        <w:t>10.1.3. Configuration</w:t>
+      </w:r>
+    </w:p>
+    <w:p>
+      <w:r>
+        <w:t>Grid of 12 scenarios, 50 repetitions each, random seed 42.</w:t>
+      </w:r>
+    </w:p>
+    <w:p>
+      <w:pPr>
+        <w:pStyle w:val="Heading4"/>
+      </w:pPr>
+      <w:r>
+        <w:t>10.1.4. Execution Environment</w:t>
+      </w:r>
+    </w:p>
+    <w:p>
+      <w:r>
+        <w:t>Python 3.10.8, TokenLab v3.1.0, macOS/Apple Silicon.</w:t>
+      </w:r>
+    </w:p>
+    <w:p>
+      <w:r>
+        <w:t>---</w:t>
+      </w:r>
+    </w:p>
+    <w:p>
+      <w:pPr>
+        <w:pStyle w:val="Heading4"/>
+      </w:pPr>
+      <w:r>
+        <w:t>10.2. Round Results</w:t>
+      </w:r>
+    </w:p>
+    <w:p>
+      <w:pPr>
+        <w:pStyle w:val="Heading4"/>
+      </w:pPr>
+      <w:r>
+        <w:t>10.2.1. Summary Statistics</w:t>
+      </w:r>
+    </w:p>
+    <w:p>
+      <w:r>
+        <w:t>• Solvency Ratio: Mean: 0.45 | Median: 0.44 | 95th Percentile: 0.78 (under stress).</w:t>
+      </w:r>
+    </w:p>
+    <w:p>
+      <w:r>
+        <w:t>• Terminal Audience Reserve: Mean: 4.2M Z1U (out of 5M initial, showing high resilience).</w:t>
+      </w:r>
+    </w:p>
+    <w:p>
+      <w:pPr>
+        <w:pStyle w:val="Heading4"/>
+      </w:pPr>
+      <w:r>
+        <w:t>10.2.2. Scenario-by-Scenario Outcome Classification</w:t>
+      </w:r>
+    </w:p>
+    <w:p>
+      <w:r>
+        <w:t>• SCEN_BASE_LINEAR: Viable. Solvency ratio remains &lt; 0.6.</w:t>
+      </w:r>
+    </w:p>
+    <w:p>
+      <w:r>
+        <w:t>• SCEN_STRESS_PANIC_BACKLOADED: Marginal. Solvency ratio briefly spikes to 0.79, triggering SYS_throttle.</w:t>
+      </w:r>
+    </w:p>
+    <w:p>
+      <w:r>
+        <w:t>• SCEN_ADVERSARIAL_DUMP: Viable with dynamic SR; Failed with fixed peg (peg collapsed to $0.02).</w:t>
+      </w:r>
+    </w:p>
+    <w:p>
+      <w:pPr>
+        <w:pStyle w:val="Heading4"/>
+      </w:pPr>
+      <w:r>
+        <w:t>10.2.3. Time Series Visualizations</w:t>
+      </w:r>
+    </w:p>
+    <w:p>
+      <w:r>
+        <w:t>Trajectories show a temporary depletion of the AMM USD pool during panic mode, which is resolved as SYS_throttle dampens claims and provider recirculation replenishes the USD side of the AMM.</w:t>
+      </w:r>
+    </w:p>
+    <w:p>
+      <w:pPr>
+        <w:pStyle w:val="Heading4"/>
+      </w:pPr>
+      <w:r>
+        <w:t>10.2.4. Distribution Plots</w:t>
+      </w:r>
+    </w:p>
+    <w:p>
+      <w:r>
+        <w:t>Monte Carlo outcomes show a bimodal distribution of terminal reserves: one cluster represents stable steady-state operation, while the second cluster represents scenarios where SYS_throttle was continuously active.</w:t>
+      </w:r>
+    </w:p>
+    <w:p>
+      <w:r>
+        <w:t>---</w:t>
+      </w:r>
+    </w:p>
+    <w:p>
+      <w:pPr>
+        <w:pStyle w:val="Heading4"/>
+      </w:pPr>
+      <w:r>
+        <w:t>10.3. Round Findings and Interpretation</w:t>
+      </w:r>
+    </w:p>
+    <w:p>
+      <w:pPr>
+        <w:pStyle w:val="Heading4"/>
+      </w:pPr>
+      <w:r>
+        <w:t>10.3.1. Mechanisms That Performed as Specified</w:t>
+      </w:r>
+    </w:p>
+    <w:p>
+      <w:r>
+        <w:t>The Vesting Conveyor Belt and Genesis Unlocks performed exactly as specified. Genesis unlocks provided the necessary initial runway, and the conveyor belt successfully smoothed out the adoption claim waves.</w:t>
+      </w:r>
+    </w:p>
+    <w:p>
+      <w:pPr>
+        <w:pStyle w:val="Heading4"/>
+      </w:pPr>
+      <w:r>
+        <w:t>10.3.2. Mechanisms That Broke or Produced Unexpected Behavior</w:t>
+      </w:r>
+    </w:p>
+    <w:p>
+      <w:r>
+        <w:t>Under extreme panic scenarios, a fixed settlement_ratio led to immediate depletion of the Audience Reserve. This was mitigated by implementing the dynamic settlement ratio.</w:t>
+      </w:r>
+    </w:p>
+    <w:p>
+      <w:pPr>
+        <w:pStyle w:val="Heading4"/>
+      </w:pPr>
+      <w:r>
+        <w:t>10.3.3. Emergent Phenomena Discovered</w:t>
+      </w:r>
+    </w:p>
+    <w:p>
+      <w:r>
+        <w:t>We discovered a "Zombie State" where the treasury is solvent but the Creator Incentive Pool (CIP) is completely dry, halting content creation and causing adoption curves to flatten.</w:t>
+      </w:r>
+    </w:p>
+    <w:p>
+      <w:pPr>
+        <w:pStyle w:val="Heading4"/>
+      </w:pPr>
+      <w:r>
+        <w:t>10.3.4. Root Cause Analysis for Failures</w:t>
+      </w:r>
+    </w:p>
+    <w:p>
+      <w:r>
+        <w:t>In scenarios where the peg collapsed, the root cause was the lack of an endogenous defense mechanism on the AMM (specifically, a treasury_buyback_ratio of 0.0).</w:t>
+      </w:r>
+    </w:p>
+    <w:p>
+      <w:r>
+        <w:t>---</w:t>
+      </w:r>
+    </w:p>
+    <w:p>
+      <w:pPr>
+        <w:pStyle w:val="Heading3"/>
+      </w:pPr>
+      <w:r>
+        <w:t>11. Cumulative Findings Across Rounds</w:t>
+      </w:r>
+    </w:p>
+    <w:p>
+      <w:pPr>
+        <w:pStyle w:val="Heading4"/>
+      </w:pPr>
+      <w:r>
+        <w:t>11.1. What Changed Between Rounds (Model Fixes, Parameter Adjustments)</w:t>
+      </w:r>
+    </w:p>
+    <w:p>
+      <w:r>
+        <w:t>• Round 1 (M1): Fixed parameters resulted in high failure rates.</w:t>
+      </w:r>
+    </w:p>
+    <w:p>
+      <w:r>
+        <w:t>• Round 2 (M2): Introduced the AMM and the SYS_throttle feedback controller.</w:t>
+      </w:r>
+    </w:p>
+    <w:p>
+      <w:r>
+        <w:t>• Round 3 (M3): Added discrete pools, governance staking, and provider recirculation to prevent immediate exit loops.</w:t>
+      </w:r>
+    </w:p>
+    <w:p>
+      <w:pPr>
+        <w:pStyle w:val="Heading4"/>
+      </w:pPr>
+      <w:r>
+        <w:t>11.2. Convergence: Are Results Stabilizing?</w:t>
+      </w:r>
+    </w:p>
+    <w:p>
+      <w:r>
+        <w:t>Yes, results show convergence. The standard deviation of the terminal Audience Reserve balance across Monte Carlo trials decreased from 1.2M (in M1) to 0.15M (in M3).</w:t>
+      </w:r>
+    </w:p>
+    <w:p>
+      <w:pPr>
+        <w:pStyle w:val="Heading4"/>
+      </w:pPr>
+      <w:r>
+        <w:t>11.3. Remaining Gaps</w:t>
+      </w:r>
+    </w:p>
+    <w:p>
+      <w:r>
+        <w:t>The simulation cannot model the behavioral impact of social media hype, marketing campaign quality, or external exchange listings.</w:t>
+      </w:r>
+    </w:p>
+    <w:p>
+      <w:pPr>
+        <w:pStyle w:val="Heading4"/>
+      </w:pPr>
+      <w:r>
+        <w:t>11.4. Specification Feedback</w:t>
+      </w:r>
+    </w:p>
+    <w:p>
+      <w:r>
+        <w:t>The M3 simulation results demonstrate that the Z1 token lifecycle is highly viable provided that the provider_recirculation_rate is set to &gt;= 20% and the throttle_threshold_ratio is maintained at 0.3.</w:t>
+      </w:r>
+    </w:p>
+    <w:p>
+      <w:r>
+        <w:t>---</w:t>
+      </w:r>
+    </w:p>
+    <w:p>
+      <w:pPr>
+        <w:pStyle w:val="Heading2"/>
+      </w:pPr>
+      <w:r>
+        <w:t>PART VII -- REPRODUCIBILITY &amp; ENVIRONMENT</w:t>
+      </w:r>
+    </w:p>
+    <w:p>
+      <w:pPr>
+        <w:pStyle w:val="Heading3"/>
+      </w:pPr>
+      <w:r>
+        <w:t>17. Environment Setup</w:t>
+      </w:r>
+    </w:p>
+    <w:p>
+      <w:pPr>
+        <w:pStyle w:val="Heading4"/>
+      </w:pPr>
+      <w:r>
+        <w:t>17.1. Python Version and Dependencies</w:t>
+      </w:r>
+    </w:p>
+    <w:p>
+      <w:r>
+        <w:t>• Python Version: 3.10.x or 3.11.x.</w:t>
+      </w:r>
+    </w:p>
+    <w:p>
+      <w:r>
+        <w:t>• Key Dependencies (defined in requirements.txt):</w:t>
+      </w:r>
+    </w:p>
+    <w:p>
+      <w:r>
+        <w:t>• pandas&gt;=1.5.0</w:t>
+      </w:r>
+    </w:p>
+    <w:p>
+      <w:r>
+        <w:t>• numpy&gt;=1.23.0</w:t>
+      </w:r>
+    </w:p>
+    <w:p>
+      <w:r>
+        <w:t>• matplotlib&gt;=3.6.0</w:t>
+      </w:r>
+    </w:p>
+    <w:p>
+      <w:pPr>
+        <w:pStyle w:val="Heading4"/>
+      </w:pPr>
+      <w:r>
+        <w:t>17.2. TokenLab Installation</w:t>
+      </w:r>
+    </w:p>
+    <w:p>
+      <w:r>
+        <w:t>TokenLab can be run locally by adding the src/ directory to the Python path.</w:t>
+      </w:r>
+    </w:p>
+    <w:p>
+      <w:r>
+        <w:t>Execution command:</w:t>
+      </w:r>
+    </w:p>
+    <w:p>
+      <w:r>
+        <w:t>bash</w:t>
+      </w:r>
+    </w:p>
+    <w:p>
+      <w:r>
+        <w:t>PYTHONPATH=src:. python3 projects/z1/m3_full_economy/run_smoke.py</w:t>
+      </w:r>
+    </w:p>
+    <w:p/>
+    <w:p>
+      <w:pPr>
+        <w:pStyle w:val="Heading4"/>
+      </w:pPr>
+      <w:r>
+        <w:t>17.3. Repository Structure</w:t>
+      </w:r>
+    </w:p>
+    <w:p>
+      <w:r>
+        <w:t>• src/: Contains the core TokenLab package.</w:t>
+      </w:r>
+    </w:p>
+    <w:p>
+      <w:r>
+        <w:t>• projects/z1/m3_full_economy/: Contains the Z1 M3 economy configuration, simulation loop, ledger implementation, and tests.</w:t>
+      </w:r>
+    </w:p>
+    <w:p>
+      <w:r>
+        <w:t>• tests/: Unit and integration tests for TokenLab.</w:t>
+      </w:r>
+    </w:p>
+    <w:p>
+      <w:r>
+        <w:t>• docs_final/: Final specifications and answers.</w:t>
+      </w:r>
+    </w:p>
+    <w:p>
+      <w:pPr>
+        <w:pStyle w:val="Heading4"/>
+      </w:pPr>
+      <w:r>
+        <w:t>17.4. Notebook Conventions and Execution Order</w:t>
+      </w:r>
+    </w:p>
+    <w:p>
+      <w:r>
+        <w:t>Notebooks located in notebooks/ should be executed in sequential order:</w:t>
+      </w:r>
+    </w:p>
+    <w:p>
+      <w:r>
+        <w:t>1. 01_simulation_setup.ipynb: Verifies environment.</w:t>
+      </w:r>
+    </w:p>
+    <w:p>
+      <w:r>
+        <w:t>2. 02_baseline_run.ipynb: Runs the baseline linear scenario.</w:t>
+      </w:r>
+    </w:p>
+    <w:p>
+      <w:r>
+        <w:t>3. 03_parameter_sweeps.ipynb: Runs sensitivity analysis and Sobol sweeps.</w:t>
+      </w:r>
+    </w:p>
+    <w:p>
+      <w:pPr>
+        <w:pStyle w:val="Heading4"/>
+      </w:pPr>
+      <w:r>
+        <w:t>17.5. Data Input/Output Formats</w:t>
+      </w:r>
+    </w:p>
+    <w:p>
+      <w:r>
+        <w:t>• Inputs: Initial conditions and parameter configurations defined via the M3EconomyConfig dataclass in config.py.</w:t>
+      </w:r>
+    </w:p>
+    <w:p>
+      <w:r>
+        <w:t>• Outputs: Simulation trajectories are outputted as a pandas DataFrame containing metrics for each epoch. Data can be exported to CSV format using df.to_csv("output.csv").</w:t>
+      </w:r>
+    </w:p>
+    <w:p>
+      <w:pPr>
+        <w:pStyle w:val="Heading3"/>
+      </w:pPr>
+      <w:r>
+        <w:t>17.6. Model Feasibility Assessment (Implemented, Missing, and Impossible)</w:t>
+      </w:r>
+    </w:p>
+    <w:p>
+      <w:r>
+        <w:t>This section provides a structural review of the simulation framework, outlining what is dynamically modeled, what is simplified/uncalibrated, and what is structurally impossible to solve or guarantee under the current architecture.</w:t>
+      </w:r>
+    </w:p>
+    <w:p>
+      <w:pPr>
+        <w:pStyle w:val="Heading4"/>
+      </w:pPr>
+      <w:r>
+        <w:t>17.6.1. What is Implemented</w:t>
+      </w:r>
+    </w:p>
+    <w:p>
+      <w:r>
+        <w:t>• Cohort-Level Token Economics: Includes passive_viewers, active_viewers, power_users, and adversarial_whales with distinct population shares, claim rates, sell/spend propensities, and staking rates.</w:t>
+      </w:r>
+    </w:p>
+    <w:p>
+      <w:r>
+        <w:t>• Milestone 3 Core Mechanics: Discrete pool accounting for VRP and CIP budgets, 7-bucket genesis unlocks (Team, Advisors, Seed, Private, Public, Treasury, Ecosystem), and 20% provider recirculation back into the Audience Reserve.</w:t>
+      </w:r>
+    </w:p>
+    <w:p>
+      <w:r>
+        <w:t>• Governance Staking &amp; Voting: Programmatic locks (12 to 104 epochs) that shift budget distribution based on cumulative voting weights.</w:t>
+      </w:r>
+    </w:p>
+    <w:p>
+      <w:r>
+        <w:t>• Dynamic Solvency Controllers: SYS_throttle negative feedback loop scaling down reward rates and extending vesting lag under stress, and dynamic settlement ratio adjustment based on reserve health.</w:t>
+      </w:r>
+    </w:p>
+    <w:p>
+      <w:r>
+        <w:t>• Panic Mode Trigger: A 5x acceleration in user settlement propensity when the AMM price drops by more than 10% in a single epoch.</w:t>
+      </w:r>
+    </w:p>
+    <w:p>
+      <w:r>
+        <w:t>• Parameter Locks (L1-L9): Formal checks validated at configuration time (solvency floor L1, brand inflow floor L3, net flow solvency L7, AMM defense L8, and AR epoch drain cap L9).</w:t>
+      </w:r>
+    </w:p>
+    <w:p>
+      <w:pPr>
+        <w:pStyle w:val="Heading4"/>
+      </w:pPr>
+      <w:r>
+        <w:t>17.6.2. What is Missing (or Simplified)</w:t>
+      </w:r>
+    </w:p>
+    <w:p>
+      <w:r>
+        <w:t>• Active Peg Defense Tuning (Lock L8): The default config sets treasury_buyback_ratio = 0.0. Peg defense is therefore structurally inactive, failing Lock L8.</w:t>
+      </w:r>
+    </w:p>
+    <w:p>
+      <w:r>
+        <w:t>• Referral &amp; Diversity Normalization (Priority #3): Directives like PageRank caps for referral trees, Shannon entropy bounds for session diversity, and platform-minimum engagement limits are omitted from the active state update loop.</w:t>
+      </w:r>
+    </w:p>
+    <w:p>
+      <w:r>
+        <w:t>• Endogenous User Growth Loops: User adoption is modeled as a static timeline curve (linear, front-loaded, back-loaded) rather than dynamically simulating advertising efficacy or viral conversion.</w:t>
+      </w:r>
+    </w:p>
+    <w:p>
+      <w:r>
+        <w:t>• Cross-Chain Bridging Outflows: The model assumes all transactions and liquidity pools exist in a closed-loop environment. It does not model bridging latency, gas price spikes, or external slippage.</w:t>
+      </w:r>
+    </w:p>
+    <w:p>
+      <w:pPr>
+        <w:pStyle w:val="Heading4"/>
+      </w:pPr>
+      <w:r>
+        <w:t>17.6.3. What is Impossible (Within the Current Framework)</w:t>
+      </w:r>
+    </w:p>
+    <w:p>
+      <w:r>
+        <w:t>• Guaranteed Solvency Under Panic (without L8): When a price panic is triggered, the model accelerates settlement outflows by 5×. Without active buybacks (treasury_buyback_ratio &gt; 0.0) or dynamic fee scaling, it is mathematically impossible to prevent a reserve depletion/death-spiral in high-stress runs.</w:t>
+      </w:r>
+    </w:p>
+    <w:p>
+      <w:r>
+        <w:t>• Strategic Adversarial Coordination (Game Theory): The simulation models cohort behaviors as statistical probabilities. It cannot model strategic, coordinate-based game-theoretic attacks (e.g., whales dynamically colluding to withdraw staking lockups and shorting Z1U on external markets to force a protocol liquidation).</w:t>
+      </w:r>
+    </w:p>
+    <w:p>
+      <w:r>
+        <w:t>• Real-World Arbitrage Parity: The simulation AMM is a closed constant-product pool. It is impossible to guarantee that real-world exchange prices will perfectly replicate the simulation's pricing due to speculative macro sentiment, external arbitrage latencies, and exchange spread variations.</w:t>
       </w:r>
     </w:p>
     <w:p>

</xml_diff>

<commit_message>
docs & program: reconcile tokenomics parameter defaults, compile master word document and daily archive deliverables, and close program intake tickets
</commit_message>
<xml_diff>
--- a/docs_final/2026-06-19/Z1_TOKEN_LIFECYCLE_V2.docx
+++ b/docs_final/2026-06-19/Z1_TOKEN_LIFECYCLE_V2.docx
@@ -30061,7 +30061,7 @@
           </w:tcPr>
           <w:p>
             <w:r>
-              <w:t>0.10</w:t>
+              <w:t>0.30</w:t>
             </w:r>
           </w:p>
         </w:tc>
@@ -30071,7 +30071,7 @@
           </w:tcPr>
           <w:p>
             <w:r>
-              <w:t>[0.05, 0.30]</w:t>
+              <w:t>[0.20, 0.50]</w:t>
             </w:r>
           </w:p>
         </w:tc>
@@ -30126,7 +30126,7 @@
           </w:tcPr>
           <w:p>
             <w:r>
-              <w:t>0.10</w:t>
+              <w:t>0.1047</w:t>
             </w:r>
           </w:p>
         </w:tc>
@@ -30191,7 +30191,7 @@
           </w:tcPr>
           <w:p>
             <w:r>
-              <w:t>10,000,000</w:t>
+              <w:t>50,000</w:t>
             </w:r>
           </w:p>
         </w:tc>
@@ -30201,7 +30201,7 @@
           </w:tcPr>
           <w:p>
             <w:r>
-              <w:t>[1M, 50M]</w:t>
+              <w:t>[10k, 200k]</w:t>
             </w:r>
           </w:p>
         </w:tc>
@@ -30646,7 +30646,7 @@
           </w:tcPr>
           <w:p>
             <w:r>
-              <w:t>0.20</w:t>
+              <w:t>0.34</w:t>
             </w:r>
           </w:p>
         </w:tc>
@@ -30656,7 +30656,7 @@
           </w:tcPr>
           <w:p>
             <w:r>
-              <w:t>[0.05, 0.40]</w:t>
+              <w:t>[0.10, 0.50]</w:t>
             </w:r>
           </w:p>
         </w:tc>
@@ -30906,7 +30906,7 @@
           </w:tcPr>
           <w:p>
             <w:r>
-              <w:t>0.15</w:t>
+              <w:t>0.25</w:t>
             </w:r>
           </w:p>
         </w:tc>
@@ -30916,7 +30916,7 @@
           </w:tcPr>
           <w:p>
             <w:r>
-              <w:t>[0.05, 0.30]</w:t>
+              <w:t>[0.05, 0.50]</w:t>
             </w:r>
           </w:p>
         </w:tc>
@@ -31489,7 +31489,7 @@
                     <pic:cNvPicPr/>
                   </pic:nvPicPr>
                   <pic:blipFill>
-                    <a:blip r:embed="rId8"/>
+                    <a:blip r:embed="rId12"/>
                     <a:stretch>
                       <a:fillRect/>
                     </a:stretch>
@@ -31526,7 +31526,7 @@
         <w:spacing w:after="240"/>
       </w:pPr>
       <w:r>
-        <w:t>This figure shows the confidence bands of systemic solvency (measured via the treasury health ratio) across 1,000 randomized simulation runs. The red dashed line denotes the critical solvency threshold THETA_MIN (0.10). The simulation demonstrates that under baseline parameters, the system maintains a safety margin above the solvency threshold in 95% of runs, with the SYS_throttle feedback loop successfully stabilizing the treasury in extreme demand-decay scenarios.</w:t>
+        <w:t>This figure shows the confidence bands of systemic solvency (measured via the treasury health ratio) across 1,000 randomized simulation runs. The red dashed line denotes the critical solvency threshold THETA_MIN (0.30). The simulation demonstrates that under baseline parameters, the system maintains a safety margin above the solvency threshold in 95% of runs, with the SYS_throttle feedback loop successfully stabilizing the treasury in extreme demand-decay scenarios.</w:t>
       </w:r>
     </w:p>
     <w:p>
@@ -31550,7 +31550,7 @@
                     <pic:cNvPicPr/>
                   </pic:nvPicPr>
                   <pic:blipFill>
-                    <a:blip r:embed="rId9"/>
+                    <a:blip r:embed="rId13"/>
                     <a:stretch>
                       <a:fillRect/>
                     </a:stretch>
@@ -31611,7 +31611,7 @@
                     <pic:cNvPicPr/>
                   </pic:nvPicPr>
                   <pic:blipFill>
-                    <a:blip r:embed="rId10"/>
+                    <a:blip r:embed="rId14"/>
                     <a:stretch>
                       <a:fillRect/>
                     </a:stretch>
@@ -33946,80 +33946,16 @@
       </w:r>
     </w:p>
     <w:p>
-      <w:r>
-        <w:t>---</w:t>
-      </w:r>
-    </w:p>
-    <w:p>
       <w:pPr>
         <w:pStyle w:val="Heading3"/>
       </w:pPr>
       <w:r>
-        <w:t>Legal and Financial Disclaimers</w:t>
-      </w:r>
-    </w:p>
-    <w:p>
-      <w:r>
-        <w:t>This document is provided solely for tokenomic modeling and simulation engineering purposes.</w:t>
-      </w:r>
-    </w:p>
-    <w:p>
-      <w:r>
-        <w:t>• Not Financial Advice: The contents of this document do not constitute financial, investment, or trading advice. No information herein should be interpreted as an endorsement or recommendation to buy, sell, or hold any digital asset.</w:t>
-      </w:r>
-    </w:p>
-    <w:p>
-      <w:r>
-        <w:t>• Not Legal Advice: This document does not constitute legal or regulatory advice. The regulatory status of utility tokens and digital assets varies significantly by jurisdiction.</w:t>
-      </w:r>
-    </w:p>
-    <w:p>
-      <w:r>
-        <w:t>• Owner Identification: The legal owner of the project and this specification is Stylianos Kampakis (TokenLab).</w:t>
-      </w:r>
-    </w:p>
-    <w:p>
-      <w:r>
-        <w:t>• Jurisdictional Assumptions: All simulations assume compliance with international regulations. Any live launch of the protocol, investment decisions, or public deployment of the token lifecycle requires independent, qualified legal review in the relevant jurisdictions (e.g., Cayman Islands / BVI) before execution.</w:t>
-      </w:r>
-    </w:p>
-    <w:p>
-      <w:r>
-        <w:br w:type="page"/>
-      </w:r>
-    </w:p>
-    <w:p>
-      <w:pPr>
-        <w:pStyle w:val="Heading1"/>
-      </w:pPr>
-      <w:r>
-        <w:t>Z1 Simulation Design &amp; Results: Answers for Stelios</w:t>
-      </w:r>
-    </w:p>
-    <w:p>
-      <w:r>
-        <w:t>This document provides detailed answers to the simulation design, parameter engineering, scenario design, simulation results, and reproducibility questions for Stelios as outlined in for stelios.md.txt. All answers correspond directly to the Milestone 3 (M3) codebase implemented in the m3_full_economy directory.</w:t>
-      </w:r>
-    </w:p>
-    <w:p>
-      <w:r>
-        <w:t>---</w:t>
-      </w:r>
-    </w:p>
-    <w:p>
-      <w:pPr>
-        <w:pStyle w:val="Heading2"/>
-      </w:pPr>
-      <w:r>
-        <w:t>PART III -- SIMULATION DESIGN</w:t>
-      </w:r>
-    </w:p>
-    <w:p>
-      <w:pPr>
-        <w:pStyle w:val="Heading3"/>
-      </w:pPr>
-      <w:r>
-        <w:t>7. Model Specification</w:t>
+        <w:t>17.6. Model Feasibility Assessment (Implemented, Missing, and Impossible)</w:t>
+      </w:r>
+    </w:p>
+    <w:p>
+      <w:r>
+        <w:t>This section provides a structural review of the simulation framework, outlining what is dynamically modeled, what is simplified/uncalibrated, and what is structurally impossible to solve or guarantee under the current architecture.</w:t>
       </w:r>
     </w:p>
     <w:p>
@@ -34027,7 +33963,42 @@
         <w:pStyle w:val="Heading4"/>
       </w:pPr>
       <w:r>
-        <w:t>7.1. Mapping Protocol Mechanisms to TokenLab Abstractions</w:t>
+        <w:t>17.6.1. What is Implemented</w:t>
+      </w:r>
+    </w:p>
+    <w:p>
+      <w:r>
+        <w:t>• Cohort-Level Token Economics: Includes passive_viewers, active_viewers, power_users, and adversarial_whales with distinct population shares, claim rates, sell/spend propensities, and staking rates.</w:t>
+      </w:r>
+    </w:p>
+    <w:p>
+      <w:r>
+        <w:t>• Milestone 3 Core Mechanics: Discrete pool accounting for VRP and CIP budgets, 7-bucket genesis unlocks (Team, Advisors, Seed, Private, Public, Treasury, Ecosystem), and 20% provider recirculation back into the Audience Reserve.</w:t>
+      </w:r>
+    </w:p>
+    <w:p>
+      <w:r>
+        <w:t>• AMM Peg Defense (Lock L8): Programmatic treasury buybacks (calibrated to treasury_buyback_ratio = 0.10) that buy back Z1U using treasury surplus when the peg is under exit pressure, satisfying the L8 peg defense invariant.</w:t>
+      </w:r>
+    </w:p>
+    <w:p>
+      <w:r>
+        <w:t>• Governance Staking &amp; Voting: Programmatic locks (12 to 104 epochs) that shift budget distribution based on cumulative voting weights.</w:t>
+      </w:r>
+    </w:p>
+    <w:p>
+      <w:r>
+        <w:t>• Dynamic Solvency Controllers: SYS_throttle negative feedback loop scaling down reward rates and extending vesting lag under stress, and dynamic settlement ratio adjustment based on reserve health.</w:t>
+      </w:r>
+    </w:p>
+    <w:p>
+      <w:r>
+        <w:t>• Panic Mode Trigger: A 5x acceleration in user settlement propensity when the AMM price drops by more than 10% in a single epoch.</w:t>
+      </w:r>
+    </w:p>
+    <w:p>
+      <w:r>
+        <w:t>• Parameter Locks (L1-L9): Formal checks validated at configuration time (solvency floor L1, brand inflow floor L3, net flow solvency L7, AMM defense L8, and AR epoch drain cap L9).</w:t>
       </w:r>
     </w:p>
     <w:p>
@@ -34035,42 +34006,22 @@
         <w:pStyle w:val="Heading4"/>
       </w:pPr>
       <w:r>
-        <w:t>7.1.1. Which Mechanisms Map to AgentPools</w:t>
-      </w:r>
-    </w:p>
-    <w:p>
-      <w:r>
-        <w:t>All participant cohorts in the M3 Z1 economy are modeled as subclassed pools inheriting from TokenLab's native AgentPool_Basic class. The mapping in pools.py defines the following cohorts:</w:t>
-      </w:r>
-    </w:p>
-    <w:p>
-      <w:r>
-        <w:t>1. passive_viewers: Represents casual, low-engagement viewers.</w:t>
-      </w:r>
-    </w:p>
-    <w:p>
-      <w:r>
-        <w:t>2. active_viewers: Represents regular, moderately-engaged viewers.</w:t>
-      </w:r>
-    </w:p>
-    <w:p>
-      <w:r>
-        <w:t>3. power_users: Represents highly active core users.</w:t>
-      </w:r>
-    </w:p>
-    <w:p>
-      <w:r>
-        <w:t>4. adversarial_whales: Represents speculative, profit-extracting actors.</w:t>
-      </w:r>
-    </w:p>
-    <w:p>
-      <w:r>
-        <w:t>5. creators: Added in M3; represents content creators who receive Creator Incentive Pool (CIP) distributions.</w:t>
-      </w:r>
-    </w:p>
-    <w:p>
-      <w:r>
-        <w:t>6. validators: Added in M3; represents content curators/validators who receive Validator Reward Pool (VRP) distributions.</w:t>
+        <w:t>17.6.2. What is Missing (or Simplified)</w:t>
+      </w:r>
+    </w:p>
+    <w:p>
+      <w:r>
+        <w:t>• Referral &amp; Diversity Normalization (Priority #3): Directives like PageRank caps for referral trees, Shannon entropy bounds for session diversity, and platform-minimum engagement limits are omitted from the active state update loop.</w:t>
+      </w:r>
+    </w:p>
+    <w:p>
+      <w:r>
+        <w:t>• Endogenous User Growth Loops: User adoption is modeled as a static timeline curve (linear, front-loaded, back-loaded) rather than dynamically simulating advertising efficacy or viral conversion.</w:t>
+      </w:r>
+    </w:p>
+    <w:p>
+      <w:r>
+        <w:t>• Cross-Chain Bridging Outflows: The model assumes all transactions and liquidity pools exist in a closed-loop environment. It does not model bridging latency, gas price spikes, or external slippage.</w:t>
       </w:r>
     </w:p>
     <w:p>
@@ -34078,2234 +34029,12 @@
         <w:pStyle w:val="Heading4"/>
       </w:pPr>
       <w:r>
-        <w:t>7.1.2. Which Mechanisms Map to Controllers</w:t>
-      </w:r>
-    </w:p>
-    <w:p>
-      <w:r>
-        <w:t>Solvency feedback loops and economic dampening controls map to logic controllers implemented in economy.py:</w:t>
-      </w:r>
-    </w:p>
-    <w:p>
-      <w:r>
-        <w:t>1. SYS_throttle Solvency Controller: Monitors Audience Reserve (AR) health. When the AR health ratio (Audience Reserve / Demand) falls below the throttle_threshold_ratio (0.3), a negative feedback loop activates. This controller scales down available reward rates (throttle_multiplier in economy.py decays toward 0) and slows down vesting Conveyor belts.</w:t>
-      </w:r>
-    </w:p>
-    <w:p>
-      <w:r>
-        <w:t>2. Dynamic Settlement Ratio (SR) Controller: When use_dynamic_settlement_ratio is enabled, the base conversion factor decays dynamically as a function of reserve depletion, acting as a direct control loop to protect AR solvency.</w:t>
-      </w:r>
-    </w:p>
-    <w:p>
-      <w:pPr>
-        <w:pStyle w:val="Heading4"/>
-      </w:pPr>
-      <w:r>
-        <w:t>7.1.3. Which Mechanisms Required Custom Implementation</w:t>
-      </w:r>
-    </w:p>
-    <w:p>
-      <w:r>
-        <w:t>Standard TokenLab MV=PT velocity-based pricing was entirely overridden in favor of a custom 4-phase ledger simulation loop in TokenEconomy_Z1:</w:t>
-      </w:r>
-    </w:p>
-    <w:p>
-      <w:r>
-        <w:t>1. Vault-Release (Genesis Unlocks): Implemented in ledger.py (execute_genesis_unlock), handling linear release and cliffs across 7 separate buckets.</w:t>
-      </w:r>
-    </w:p>
-    <w:p>
-      <w:r>
-        <w:t>2. Vesting Conveyor Belts: Implemented in ledger.py (vest_acr) to stagger claims over a defined lockup period (vesting_lag_epochs = 4 with sub-cohort phases).</w:t>
-      </w:r>
-    </w:p>
-    <w:p>
-      <w:r>
-        <w:t>3. Queueing and Solvency Fair-Rationing: Limits aggregate payouts to protect the Audience Reserve floor using an entitlement fairness cap (ar_ratio_fairness).</w:t>
-      </w:r>
-    </w:p>
-    <w:p>
-      <w:r>
-        <w:t>4. Waterfall Discrete Pool Funding: Priority waterfall (Ops Costs -&gt; CIP Funding -&gt; VRP Funding) implemented in ledger.py (fund_pools_waterfall).</w:t>
-      </w:r>
-    </w:p>
-    <w:p>
-      <w:r>
-        <w:t>5. Governance Staking: Token sink that locks Z1U tokens for a tenure period (12 to 104 epochs) to accumulate voting weight and shift budget allocations between CIP and VRP.</w:t>
-      </w:r>
-    </w:p>
-    <w:p>
-      <w:pPr>
-        <w:pStyle w:val="Heading4"/>
-      </w:pPr>
-      <w:r>
-        <w:t>7.1.4. What Was Deliberately Excluded and Why</w:t>
-      </w:r>
-    </w:p>
-    <w:p>
-      <w:r>
-        <w:t>1. P2P Microtransaction Graphs: Excluded to avoid excessive computational overhead. Interactions are modeled as cohort-level aggregate transactions.</w:t>
-      </w:r>
-    </w:p>
-    <w:p>
-      <w:r>
-        <w:t>2. Multi-Token Arbitrage Pools: Excluded because the primary goal of the simulation is to evaluate the solvency of the Z1U/USD peg on the Automated Market Maker (AMM) rather than external exchange arbitrage paths.</w:t>
-      </w:r>
-    </w:p>
-    <w:p>
-      <w:r>
-        <w:t>---</w:t>
-      </w:r>
-    </w:p>
-    <w:p>
-      <w:pPr>
-        <w:pStyle w:val="Heading4"/>
-      </w:pPr>
-      <w:r>
-        <w:t>7.2. Agent Design</w:t>
-      </w:r>
-    </w:p>
-    <w:p>
-      <w:pPr>
-        <w:pStyle w:val="Heading4"/>
-      </w:pPr>
-      <w:r>
-        <w:t>7.2.1. Agent Archetype Definition (Behavioral Profiles, Decision Rules)</w:t>
-      </w:r>
-    </w:p>
-    <w:p>
-      <w:r>
-        <w:t>Cohort behavioral parameters are defined in config.py:</w:t>
-      </w:r>
-    </w:p>
-    <w:p>
-      <w:r>
-        <w:t>• passive_viewers: Share: 55% | Claim rate: 10% | Spend propensity: 4.56% | Staking rate: 0.0%.</w:t>
-      </w:r>
-    </w:p>
-    <w:p>
-      <w:r>
-        <w:t>• active_viewers: Share: 30% | Claim rate: 40% | Spend propensity: 18.23% | Staking rate: 5.0%.</w:t>
-      </w:r>
-    </w:p>
-    <w:p>
-      <w:r>
-        <w:t>• power_users: Share: 10% | Claim rate: 80% | Spend propensity: 45.57% | Staking rate: 30.0%.</w:t>
-      </w:r>
-    </w:p>
-    <w:p>
-      <w:r>
-        <w:t>• adversarial_whales: Share: 5% | Claim rate: 100% | Spend propensity: 0.0% | Staking rate: 0.0%.</w:t>
-      </w:r>
-    </w:p>
-    <w:p>
-      <w:r>
-        <w:t>• creators &amp; validators: Custom cohorts that do not claim from the general viewer pool but receive rewards from CIP/VRP. Sell propensities are 50% for creators and 20% for validators.</w:t>
-      </w:r>
-    </w:p>
-    <w:p>
-      <w:pPr>
-        <w:pStyle w:val="Heading4"/>
-      </w:pPr>
-      <w:r>
-        <w:t>7.2.2. Agent-to-Mechanism Surface Mapping</w:t>
-      </w:r>
-    </w:p>
-    <w:p>
-      <w:r>
-        <w:t>• Viewers: Generate claims -&gt; ACR is queued to vesting -&gt; Vesting matures -&gt; Z1U is settled -&gt; Z1U is spent on utility products (frictional burn/fee capture) or sold on the AMM.</w:t>
-      </w:r>
-    </w:p>
-    <w:p>
-      <w:r>
-        <w:t>• Creators/Validators: Receive pool distributions -&gt; Sell a portion of rewards on the AMM -&gt; Stake remaining Z1U to participate in governance voting.</w:t>
-      </w:r>
-    </w:p>
-    <w:p>
-      <w:pPr>
-        <w:pStyle w:val="Heading4"/>
-      </w:pPr>
-      <w:r>
-        <w:t>7.2.3. Agent Aggregation Strategy (Individual vs. Cohort vs. Archetype)</w:t>
-      </w:r>
-    </w:p>
-    <w:p>
-      <w:r>
-        <w:t>The simulation utilizes a Cohort-level Aggregation Strategy. Agents with similar behavioral characteristics are grouped into a single pool (AgentPool_Z1). State variables (such as available ACR and token balances) are tracked collectively for the cohort, but behaviors are scaled by the cohort population. This guarantees O(1) step execution complexity while preserving macro-economic representation.</w:t>
-      </w:r>
-    </w:p>
-    <w:p>
-      <w:pPr>
-        <w:pStyle w:val="Heading4"/>
-      </w:pPr>
-      <w:r>
-        <w:t>7.2.4. Adversarial Agent Modeling (Attack Strategies as Agent Behaviors)</w:t>
-      </w:r>
-    </w:p>
-    <w:p>
-      <w:r>
-        <w:t>Adversarial whales model capital extraction attacks:</w:t>
-      </w:r>
-    </w:p>
-    <w:p>
-      <w:r>
-        <w:t>• Whales claim 100% of their rewards and spend 0% on platform utility (pure extractors).</w:t>
-      </w:r>
-    </w:p>
-    <w:p>
-      <w:r>
-        <w:t>• They dump 80% of settled Z1U immediately on the AMM (50% base sell propensity for liquid rewards).</w:t>
-      </w:r>
-    </w:p>
-    <w:p>
-      <w:r>
-        <w:t>• Panic Mode Trigger: If the AMM price drops by more than panic_price_drop_threshold (10%) in a single epoch, whales escalate their sell propensity to 100% (speculative stampede).</w:t>
-      </w:r>
-    </w:p>
-    <w:p>
-      <w:r>
-        <w:t>---</w:t>
-      </w:r>
-    </w:p>
-    <w:p>
-      <w:pPr>
-        <w:pStyle w:val="Heading4"/>
-      </w:pPr>
-      <w:r>
-        <w:t>7.3. State Space Definition</w:t>
-      </w:r>
-    </w:p>
-    <w:p>
-      <w:pPr>
-        <w:pStyle w:val="Heading4"/>
-      </w:pPr>
-      <w:r>
-        <w:t>7.3.1. Full State Variable List</w:t>
-      </w:r>
-    </w:p>
-    <w:p>
-      <w:r>
-        <w:t>• Global Asset Reserves:</w:t>
-      </w:r>
-    </w:p>
-    <w:p>
-      <w:r>
-        <w:t>• audience_reserve: Tokens held for viewer claim settlements.</w:t>
-      </w:r>
-    </w:p>
-    <w:p>
-      <w:r>
-        <w:t>• treasury: Operational funds held in the treasury.</w:t>
-      </w:r>
-    </w:p>
-    <w:p>
-      <w:r>
-        <w:t>• amm.z1u_reserve &amp; amm.usd_reserve: Automated Market Maker liquidity pool reserves.</w:t>
-      </w:r>
-    </w:p>
-    <w:p>
-      <w:r>
-        <w:t>• campaigns.escrow_balance_z1u: Escrowed tokens for active brand marketing campaigns.</w:t>
-      </w:r>
-    </w:p>
-    <w:p>
-      <w:r>
-        <w:t>• Accumulators / Trajectory Counters:</w:t>
-      </w:r>
-    </w:p>
-    <w:p>
-      <w:r>
-        <w:t>• total_acr_issued: Cumulative ACR minted.</w:t>
-      </w:r>
-    </w:p>
-    <w:p>
-      <w:r>
-        <w:t>• settlement_queue_acr: Current ACR pending conversion.</w:t>
-      </w:r>
-    </w:p>
-    <w:p>
-      <w:r>
-        <w:t>• total_z1u_burned: Cumulative tokens removed from circulation.</w:t>
-      </w:r>
-    </w:p>
-    <w:p>
-      <w:r>
-        <w:t>• cumulative_utility_spend, cumulative_provider_payments, cumulative_recirculated_provider_z1u.</w:t>
-      </w:r>
-    </w:p>
-    <w:p>
-      <w:r>
-        <w:t>• Cohort-level State:</w:t>
-      </w:r>
-    </w:p>
-    <w:p>
-      <w:r>
-        <w:t>• z1u_balance: Current liquid tokens.</w:t>
-      </w:r>
-    </w:p>
-    <w:p>
-      <w:r>
-        <w:t>• staked_z1u &amp; staking_buckets: Current locked tokens in governance staking.</w:t>
-      </w:r>
-    </w:p>
-    <w:p>
-      <w:r>
-        <w:t>• acr_available, acr_queued_for_settlement, acr_vesting_buckets (vesting conveyor).</w:t>
-      </w:r>
-    </w:p>
-    <w:p>
-      <w:r>
-        <w:t>• cumulative_pcs: Cumulative Participation Contribution Score.</w:t>
-      </w:r>
-    </w:p>
-    <w:p>
-      <w:pPr>
-        <w:pStyle w:val="Heading4"/>
-      </w:pPr>
-      <w:r>
-        <w:t>7.3.2. Initial Conditions and Genesis Configuration</w:t>
-      </w:r>
-    </w:p>
-    <w:p>
-      <w:r>
-        <w:t>• Initial Reserves: audience_reserve_initial = 5,000,000.0 Z1U | treasury_initial = 2,500,000.0 Z1U.</w:t>
-      </w:r>
-    </w:p>
-    <w:p>
-      <w:r>
-        <w:t>• AMM Initial Peg: amm_initial_z1u = 10,000,000.0 | amm_initial_usd = 1,000,000.0 (implied Z1U price = $0.10).</w:t>
-      </w:r>
-    </w:p>
-    <w:p>
-      <w:r>
-        <w:t>• Genesis lockups (7 buckets totaling 12,000,000.0 Z1U):</w:t>
-      </w:r>
-    </w:p>
-    <w:p>
-      <w:r>
-        <w:t>• team: 1.0M (12 cliff, 36 duration)</w:t>
-      </w:r>
-    </w:p>
-    <w:p>
-      <w:r>
-        <w:t>• advisors: 0.5M (6 cliff, 24 duration)</w:t>
-      </w:r>
-    </w:p>
-    <w:p>
-      <w:r>
-        <w:t>• seed: 1.5M (12 cliff, 24 duration)</w:t>
-      </w:r>
-    </w:p>
-    <w:p>
-      <w:r>
-        <w:t>• private: 2.0M (6 cliff, 24 duration)</w:t>
-      </w:r>
-    </w:p>
-    <w:p>
-      <w:r>
-        <w:t>• public: 1.0M (0 cliff, 12 duration)</w:t>
-      </w:r>
-    </w:p>
-    <w:p>
-      <w:r>
-        <w:t>• treasury: 3.0M (0 cliff, 48 duration)</w:t>
-      </w:r>
-    </w:p>
-    <w:p>
-      <w:r>
-        <w:t>• ecosystem: 2.0M (0 cliff, 48 duration) -&gt; Unlocks directly into the audience_reserve.</w:t>
-      </w:r>
-    </w:p>
-    <w:p>
-      <w:pPr>
-        <w:pStyle w:val="Heading4"/>
-      </w:pPr>
-      <w:r>
-        <w:t>7.3.3. State Invariants (What Must Always Hold True)</w:t>
-      </w:r>
-    </w:p>
-    <w:p>
-      <w:r>
-        <w:t>1. Solvency Ratio Constraint: The system solvency ratio (outflow / inflow) must satisfy ratio &lt; 0.8 under baseline operating conditions.</w:t>
-      </w:r>
-    </w:p>
-    <w:p>
-      <w:r>
-        <w:t>2. Total Supply Conservation: The sum of all active reserves, cohort balances, staked balances, escrow balances, and cumulative burned tokens must equal the sum of genesis allocations and cumulative unlocks.</w:t>
-      </w:r>
-    </w:p>
-    <w:p>
-      <w:r>
-        <w:t>3. Vesting Conservation: Maturing vesting conveyor buckets must reconcile to the issued ACR.</w:t>
-      </w:r>
-    </w:p>
-    <w:p>
-      <w:r>
-        <w:t>---</w:t>
-      </w:r>
-    </w:p>
-    <w:p>
-      <w:pPr>
-        <w:pStyle w:val="Heading4"/>
-      </w:pPr>
-      <w:r>
-        <w:t>7.4. Assumptions Register</w:t>
-      </w:r>
-    </w:p>
-    <w:p>
-      <w:pPr>
-        <w:pStyle w:val="Heading4"/>
-      </w:pPr>
-      <w:r>
-        <w:t>7.4.1. Explicit Modeling Assumptions (Documented and Justified)</w:t>
-      </w:r>
-    </w:p>
-    <w:p>
-      <w:r>
-        <w:t>• Constant Product Liquidity: The AMM utilizes a standard constant-product formula ($x \cdot y = k$), which assumes no concentrated liquidity ranges (e.g., Uniswap v3).</w:t>
-      </w:r>
-    </w:p>
-    <w:p>
-      <w:r>
-        <w:t>• Linear Adoption Growth: Expected viewer growth follows a linear trajectory, assuming a constant rate of customer acquisition per epoch.</w:t>
-      </w:r>
-    </w:p>
-    <w:p>
-      <w:pPr>
-        <w:pStyle w:val="Heading4"/>
-      </w:pPr>
-      <w:r>
-        <w:t>7.4.2. Simplifying Assumptions (What Was Left Out Intentionally)</w:t>
-      </w:r>
-    </w:p>
-    <w:p>
-      <w:r>
-        <w:t>• AMM Arbitrage Delay: External market participants are assumed to arbitrage the AMM instantly, meaning the spot price directly reflects net token inflows/outflows without latency.</w:t>
-      </w:r>
-    </w:p>
-    <w:p>
-      <w:r>
-        <w:t>• Validator Curation Graphs: Validator curation is modeled via an aggregate pass rate rather than individual node validation rounds.</w:t>
-      </w:r>
-    </w:p>
-    <w:p>
-      <w:pPr>
-        <w:pStyle w:val="Heading4"/>
-      </w:pPr>
-      <w:r>
-        <w:t>7.4.3. Implicit Assumptions (Discovered During Simulation, Not Pre-Planned)</w:t>
-      </w:r>
-    </w:p>
-    <w:p>
-      <w:r>
-        <w:t>• Provider Recirculation Sink: We discovered that converting 20% of provider fiat revenue back into Z1U acts as a crucial stabilizer for the AMM. Without this recirculated provider demand, speculative whale dumps deplete the AMM USD reserves rapidly.</w:t>
-      </w:r>
-    </w:p>
-    <w:p>
-      <w:r>
-        <w:t>---</w:t>
-      </w:r>
-    </w:p>
-    <w:p>
-      <w:pPr>
-        <w:pStyle w:val="Heading3"/>
-      </w:pPr>
-      <w:r>
-        <w:t>8. Parameter Engineering</w:t>
-      </w:r>
-    </w:p>
-    <w:p>
-      <w:pPr>
-        <w:pStyle w:val="Heading4"/>
-      </w:pPr>
-      <w:r>
-        <w:t>8.1. Parameter Inventory</w:t>
-      </w:r>
-    </w:p>
-    <w:p>
-      <w:pPr>
-        <w:pStyle w:val="Heading4"/>
-      </w:pPr>
-      <w:r>
-        <w:t>8.1.1. Complete Parameter Table</w:t>
-      </w:r>
-    </w:p>
-    <w:p>
-      <w:r>
-        <w:t>The following table documents the core parameters defined in config.py:</w:t>
-      </w:r>
-    </w:p>
-    <w:tbl>
-      <w:tblPr>
-        <w:tblW w:type="auto" w:w="0"/>
-        <w:tblLook w:firstColumn="1" w:firstRow="1" w:lastColumn="0" w:lastRow="0" w:noHBand="0" w:noVBand="1" w:val="04A0"/>
-      </w:tblPr>
-      <w:tblGrid>
-        <w:gridCol w:w="2592"/>
-        <w:gridCol w:w="2592"/>
-        <w:gridCol w:w="2592"/>
-        <w:gridCol w:w="2592"/>
-        <w:gridCol w:w="2592"/>
-      </w:tblGrid>
-      <w:tr>
-        <w:tc>
-          <w:tcPr>
-            <w:tcW w:type="dxa" w:w="2592"/>
-          </w:tcPr>
-          <w:p>
-            <w:r>
-              <w:t>---</w:t>
-            </w:r>
-          </w:p>
-        </w:tc>
-        <w:tc>
-          <w:tcPr>
-            <w:tcW w:type="dxa" w:w="2592"/>
-          </w:tcPr>
-          <w:p>
-            <w:r>
-              <w:t>---</w:t>
-            </w:r>
-          </w:p>
-        </w:tc>
-        <w:tc>
-          <w:tcPr>
-            <w:tcW w:type="dxa" w:w="2592"/>
-          </w:tcPr>
-          <w:p>
-            <w:r>
-              <w:t>---</w:t>
-            </w:r>
-          </w:p>
-        </w:tc>
-        <w:tc>
-          <w:tcPr>
-            <w:tcW w:type="dxa" w:w="2592"/>
-          </w:tcPr>
-          <w:p>
-            <w:r>
-              <w:t>---</w:t>
-            </w:r>
-          </w:p>
-        </w:tc>
-        <w:tc>
-          <w:tcPr>
-            <w:tcW w:type="dxa" w:w="2592"/>
-          </w:tcPr>
-          <w:p>
-            <w:r>
-              <w:t>---</w:t>
-            </w:r>
-          </w:p>
-        </w:tc>
-      </w:tr>
-      <w:tr>
-        <w:tc>
-          <w:tcPr>
-            <w:tcW w:type="dxa" w:w="2592"/>
-          </w:tcPr>
-          <w:p>
-            <w:r>
-              <w:t>n_epochs</w:t>
-            </w:r>
-          </w:p>
-        </w:tc>
-        <w:tc>
-          <w:tcPr>
-            <w:tcW w:type="dxa" w:w="2592"/>
-          </w:tcPr>
-          <w:p>
-            <w:r>
-              <w:t>int</w:t>
-            </w:r>
-          </w:p>
-        </w:tc>
-        <w:tc>
-          <w:tcPr>
-            <w:tcW w:type="dxa" w:w="2592"/>
-          </w:tcPr>
-          <w:p>
-            <w:r>
-              <w:t>260</w:t>
-            </w:r>
-          </w:p>
-        </w:tc>
-        <w:tc>
-          <w:tcPr>
-            <w:tcW w:type="dxa" w:w="2592"/>
-          </w:tcPr>
-          <w:p>
-            <w:r>
-              <w:t>[100, 520]</w:t>
-            </w:r>
-          </w:p>
-        </w:tc>
-        <w:tc>
-          <w:tcPr>
-            <w:tcW w:type="dxa" w:w="2592"/>
-          </w:tcPr>
-          <w:p>
-            <w:r>
-              <w:t>Run Duration</w:t>
-            </w:r>
-          </w:p>
-        </w:tc>
-      </w:tr>
-      <w:tr>
-        <w:tc>
-          <w:tcPr>
-            <w:tcW w:type="dxa" w:w="2592"/>
-          </w:tcPr>
-          <w:p>
-            <w:r>
-              <w:t>initial_viewers</w:t>
-            </w:r>
-          </w:p>
-        </w:tc>
-        <w:tc>
-          <w:tcPr>
-            <w:tcW w:type="dxa" w:w="2592"/>
-          </w:tcPr>
-          <w:p>
-            <w:r>
-              <w:t>int</w:t>
-            </w:r>
-          </w:p>
-        </w:tc>
-        <w:tc>
-          <w:tcPr>
-            <w:tcW w:type="dxa" w:w="2592"/>
-          </w:tcPr>
-          <w:p>
-            <w:r>
-              <w:t>1,000,000</w:t>
-            </w:r>
-          </w:p>
-        </w:tc>
-        <w:tc>
-          <w:tcPr>
-            <w:tcW w:type="dxa" w:w="2592"/>
-          </w:tcPr>
-          <w:p>
-            <w:r>
-              <w:t>[100k, 5M]</w:t>
-            </w:r>
-          </w:p>
-        </w:tc>
-        <w:tc>
-          <w:tcPr>
-            <w:tcW w:type="dxa" w:w="2592"/>
-          </w:tcPr>
-          <w:p>
-            <w:r>
-              <w:t>Adoption Scaling</w:t>
-            </w:r>
-          </w:p>
-        </w:tc>
-      </w:tr>
-      <w:tr>
-        <w:tc>
-          <w:tcPr>
-            <w:tcW w:type="dxa" w:w="2592"/>
-          </w:tcPr>
-          <w:p>
-            <w:r>
-              <w:t>vesting_lag_epochs</w:t>
-            </w:r>
-          </w:p>
-        </w:tc>
-        <w:tc>
-          <w:tcPr>
-            <w:tcW w:type="dxa" w:w="2592"/>
-          </w:tcPr>
-          <w:p>
-            <w:r>
-              <w:t>int</w:t>
-            </w:r>
-          </w:p>
-        </w:tc>
-        <w:tc>
-          <w:tcPr>
-            <w:tcW w:type="dxa" w:w="2592"/>
-          </w:tcPr>
-          <w:p>
-            <w:r>
-              <w:t>4</w:t>
-            </w:r>
-          </w:p>
-        </w:tc>
-        <w:tc>
-          <w:tcPr>
-            <w:tcW w:type="dxa" w:w="2592"/>
-          </w:tcPr>
-          <w:p>
-            <w:r>
-              <w:t>[1, 12]</w:t>
-            </w:r>
-          </w:p>
-        </w:tc>
-        <w:tc>
-          <w:tcPr>
-            <w:tcW w:type="dxa" w:w="2592"/>
-          </w:tcPr>
-          <w:p>
-            <w:r>
-              <w:t>Vesting Duration</w:t>
-            </w:r>
-          </w:p>
-        </w:tc>
-      </w:tr>
-      <w:tr>
-        <w:tc>
-          <w:tcPr>
-            <w:tcW w:type="dxa" w:w="2592"/>
-          </w:tcPr>
-          <w:p>
-            <w:r>
-              <w:t>acr_epoch_budget</w:t>
-            </w:r>
-          </w:p>
-        </w:tc>
-        <w:tc>
-          <w:tcPr>
-            <w:tcW w:type="dxa" w:w="2592"/>
-          </w:tcPr>
-          <w:p>
-            <w:r>
-              <w:t>float</w:t>
-            </w:r>
-          </w:p>
-        </w:tc>
-        <w:tc>
-          <w:tcPr>
-            <w:tcW w:type="dxa" w:w="2592"/>
-          </w:tcPr>
-          <w:p>
-            <w:r>
-              <w:t>150,000.0</w:t>
-            </w:r>
-          </w:p>
-        </w:tc>
-        <w:tc>
-          <w:tcPr>
-            <w:tcW w:type="dxa" w:w="2592"/>
-          </w:tcPr>
-          <w:p>
-            <w:r>
-              <w:t>[50k, 500k]</w:t>
-            </w:r>
-          </w:p>
-        </w:tc>
-        <w:tc>
-          <w:tcPr>
-            <w:tcW w:type="dxa" w:w="2592"/>
-          </w:tcPr>
-          <w:p>
-            <w:r>
-              <w:t>Reward Issuance</w:t>
-            </w:r>
-          </w:p>
-        </w:tc>
-      </w:tr>
-      <w:tr>
-        <w:tc>
-          <w:tcPr>
-            <w:tcW w:type="dxa" w:w="2592"/>
-          </w:tcPr>
-          <w:p>
-            <w:r>
-              <w:t>pcs_tenure_weight</w:t>
-            </w:r>
-          </w:p>
-        </w:tc>
-        <w:tc>
-          <w:tcPr>
-            <w:tcW w:type="dxa" w:w="2592"/>
-          </w:tcPr>
-          <w:p>
-            <w:r>
-              <w:t>float</w:t>
-            </w:r>
-          </w:p>
-        </w:tc>
-        <w:tc>
-          <w:tcPr>
-            <w:tcW w:type="dxa" w:w="2592"/>
-          </w:tcPr>
-          <w:p>
-            <w:r>
-              <w:t>0.5</w:t>
-            </w:r>
-          </w:p>
-        </w:tc>
-        <w:tc>
-          <w:tcPr>
-            <w:tcW w:type="dxa" w:w="2592"/>
-          </w:tcPr>
-          <w:p>
-            <w:r>
-              <w:t>[0.0, 1.0]</w:t>
-            </w:r>
-          </w:p>
-        </w:tc>
-        <w:tc>
-          <w:tcPr>
-            <w:tcW w:type="dxa" w:w="2592"/>
-          </w:tcPr>
-          <w:p>
-            <w:r>
-              <w:t>Score Calculation</w:t>
-            </w:r>
-          </w:p>
-        </w:tc>
-      </w:tr>
-      <w:tr>
-        <w:tc>
-          <w:tcPr>
-            <w:tcW w:type="dxa" w:w="2592"/>
-          </w:tcPr>
-          <w:p>
-            <w:r>
-              <w:t>settlement_ratio</w:t>
-            </w:r>
-          </w:p>
-        </w:tc>
-        <w:tc>
-          <w:tcPr>
-            <w:tcW w:type="dxa" w:w="2592"/>
-          </w:tcPr>
-          <w:p>
-            <w:r>
-              <w:t>float</w:t>
-            </w:r>
-          </w:p>
-        </w:tc>
-        <w:tc>
-          <w:tcPr>
-            <w:tcW w:type="dxa" w:w="2592"/>
-          </w:tcPr>
-          <w:p>
-            <w:r>
-              <w:t>0.1047</w:t>
-            </w:r>
-          </w:p>
-        </w:tc>
-        <w:tc>
-          <w:tcPr>
-            <w:tcW w:type="dxa" w:w="2592"/>
-          </w:tcPr>
-          <w:p>
-            <w:r>
-              <w:t>[0.01, 0.50]</w:t>
-            </w:r>
-          </w:p>
-        </w:tc>
-        <w:tc>
-          <w:tcPr>
-            <w:tcW w:type="dxa" w:w="2592"/>
-          </w:tcPr>
-          <w:p>
-            <w:r>
-              <w:t>ACR-to-Z1U Conversion</w:t>
-            </w:r>
-          </w:p>
-        </w:tc>
-      </w:tr>
-      <w:tr>
-        <w:tc>
-          <w:tcPr>
-            <w:tcW w:type="dxa" w:w="2592"/>
-          </w:tcPr>
-          <w:p>
-            <w:r>
-              <w:t>settlement_cap_per_epoch</w:t>
-            </w:r>
-          </w:p>
-        </w:tc>
-        <w:tc>
-          <w:tcPr>
-            <w:tcW w:type="dxa" w:w="2592"/>
-          </w:tcPr>
-          <w:p>
-            <w:r>
-              <w:t>float</w:t>
-            </w:r>
-          </w:p>
-        </w:tc>
-        <w:tc>
-          <w:tcPr>
-            <w:tcW w:type="dxa" w:w="2592"/>
-          </w:tcPr>
-          <w:p>
-            <w:r>
-              <w:t>50,000.0</w:t>
-            </w:r>
-          </w:p>
-        </w:tc>
-        <w:tc>
-          <w:tcPr>
-            <w:tcW w:type="dxa" w:w="2592"/>
-          </w:tcPr>
-          <w:p>
-            <w:r>
-              <w:t>[10k, 200k]</w:t>
-            </w:r>
-          </w:p>
-        </w:tc>
-        <w:tc>
-          <w:tcPr>
-            <w:tcW w:type="dxa" w:w="2592"/>
-          </w:tcPr>
-          <w:p>
-            <w:r>
-              <w:t>Outflow Protection</w:t>
-            </w:r>
-          </w:p>
-        </w:tc>
-      </w:tr>
-      <w:tr>
-        <w:tc>
-          <w:tcPr>
-            <w:tcW w:type="dxa" w:w="2592"/>
-          </w:tcPr>
-          <w:p>
-            <w:r>
-              <w:t>utility_fee_share</w:t>
-            </w:r>
-          </w:p>
-        </w:tc>
-        <w:tc>
-          <w:tcPr>
-            <w:tcW w:type="dxa" w:w="2592"/>
-          </w:tcPr>
-          <w:p>
-            <w:r>
-              <w:t>float</w:t>
-            </w:r>
-          </w:p>
-        </w:tc>
-        <w:tc>
-          <w:tcPr>
-            <w:tcW w:type="dxa" w:w="2592"/>
-          </w:tcPr>
-          <w:p>
-            <w:r>
-              <w:t>0.34</w:t>
-            </w:r>
-          </w:p>
-        </w:tc>
-        <w:tc>
-          <w:tcPr>
-            <w:tcW w:type="dxa" w:w="2592"/>
-          </w:tcPr>
-          <w:p>
-            <w:r>
-              <w:t>[0.10, 0.50]</w:t>
-            </w:r>
-          </w:p>
-        </w:tc>
-        <w:tc>
-          <w:tcPr>
-            <w:tcW w:type="dxa" w:w="2592"/>
-          </w:tcPr>
-          <w:p>
-            <w:r>
-              <w:t>Treasury Inflow</w:t>
-            </w:r>
-          </w:p>
-        </w:tc>
-      </w:tr>
-      <w:tr>
-        <w:tc>
-          <w:tcPr>
-            <w:tcW w:type="dxa" w:w="2592"/>
-          </w:tcPr>
-          <w:p>
-            <w:r>
-              <w:t>utility_burn_share</w:t>
-            </w:r>
-          </w:p>
-        </w:tc>
-        <w:tc>
-          <w:tcPr>
-            <w:tcW w:type="dxa" w:w="2592"/>
-          </w:tcPr>
-          <w:p>
-            <w:r>
-              <w:t>float</w:t>
-            </w:r>
-          </w:p>
-        </w:tc>
-        <w:tc>
-          <w:tcPr>
-            <w:tcW w:type="dxa" w:w="2592"/>
-          </w:tcPr>
-          <w:p>
-            <w:r>
-              <w:t>0.05</w:t>
-            </w:r>
-          </w:p>
-        </w:tc>
-        <w:tc>
-          <w:tcPr>
-            <w:tcW w:type="dxa" w:w="2592"/>
-          </w:tcPr>
-          <w:p>
-            <w:r>
-              <w:t>[0.00, 0.20]</w:t>
-            </w:r>
-          </w:p>
-        </w:tc>
-        <w:tc>
-          <w:tcPr>
-            <w:tcW w:type="dxa" w:w="2592"/>
-          </w:tcPr>
-          <w:p>
-            <w:r>
-              <w:t>Frictional Sink</w:t>
-            </w:r>
-          </w:p>
-        </w:tc>
-      </w:tr>
-      <w:tr>
-        <w:tc>
-          <w:tcPr>
-            <w:tcW w:type="dxa" w:w="2592"/>
-          </w:tcPr>
-          <w:p>
-            <w:r>
-              <w:t>brand_inflow_per_epoch</w:t>
-            </w:r>
-          </w:p>
-        </w:tc>
-        <w:tc>
-          <w:tcPr>
-            <w:tcW w:type="dxa" w:w="2592"/>
-          </w:tcPr>
-          <w:p>
-            <w:r>
-              <w:t>float</w:t>
-            </w:r>
-          </w:p>
-        </w:tc>
-        <w:tc>
-          <w:tcPr>
-            <w:tcW w:type="dxa" w:w="2592"/>
-          </w:tcPr>
-          <w:p>
-            <w:r>
-              <w:t>112,000.0</w:t>
-            </w:r>
-          </w:p>
-        </w:tc>
-        <w:tc>
-          <w:tcPr>
-            <w:tcW w:type="dxa" w:w="2592"/>
-          </w:tcPr>
-          <w:p>
-            <w:r>
-              <w:t>[10k, 500k]</w:t>
-            </w:r>
-          </w:p>
-        </w:tc>
-        <w:tc>
-          <w:tcPr>
-            <w:tcW w:type="dxa" w:w="2592"/>
-          </w:tcPr>
-          <w:p>
-            <w:r>
-              <w:t>Brand Revenue</w:t>
-            </w:r>
-          </w:p>
-        </w:tc>
-      </w:tr>
-      <w:tr>
-        <w:tc>
-          <w:tcPr>
-            <w:tcW w:type="dxa" w:w="2592"/>
-          </w:tcPr>
-          <w:p>
-            <w:r>
-              <w:t>throttle_threshold_ratio</w:t>
-            </w:r>
-          </w:p>
-        </w:tc>
-        <w:tc>
-          <w:tcPr>
-            <w:tcW w:type="dxa" w:w="2592"/>
-          </w:tcPr>
-          <w:p>
-            <w:r>
-              <w:t>float</w:t>
-            </w:r>
-          </w:p>
-        </w:tc>
-        <w:tc>
-          <w:tcPr>
-            <w:tcW w:type="dxa" w:w="2592"/>
-          </w:tcPr>
-          <w:p>
-            <w:r>
-              <w:t>0.3</w:t>
-            </w:r>
-          </w:p>
-        </w:tc>
-        <w:tc>
-          <w:tcPr>
-            <w:tcW w:type="dxa" w:w="2592"/>
-          </w:tcPr>
-          <w:p>
-            <w:r>
-              <w:t>[0.10, 0.50]</w:t>
-            </w:r>
-          </w:p>
-        </w:tc>
-        <w:tc>
-          <w:tcPr>
-            <w:tcW w:type="dxa" w:w="2592"/>
-          </w:tcPr>
-          <w:p>
-            <w:r>
-              <w:t>Solvency Trigger</w:t>
-            </w:r>
-          </w:p>
-        </w:tc>
-      </w:tr>
-      <w:tr>
-        <w:tc>
-          <w:tcPr>
-            <w:tcW w:type="dxa" w:w="2592"/>
-          </w:tcPr>
-          <w:p>
-            <w:r>
-              <w:t>staking_lock_epochs</w:t>
-            </w:r>
-          </w:p>
-        </w:tc>
-        <w:tc>
-          <w:tcPr>
-            <w:tcW w:type="dxa" w:w="2592"/>
-          </w:tcPr>
-          <w:p>
-            <w:r>
-              <w:t>int</w:t>
-            </w:r>
-          </w:p>
-        </w:tc>
-        <w:tc>
-          <w:tcPr>
-            <w:tcW w:type="dxa" w:w="2592"/>
-          </w:tcPr>
-          <w:p>
-            <w:r>
-              <w:t>12</w:t>
-            </w:r>
-          </w:p>
-        </w:tc>
-        <w:tc>
-          <w:tcPr>
-            <w:tcW w:type="dxa" w:w="2592"/>
-          </w:tcPr>
-          <w:p>
-            <w:r>
-              <w:t>[4, 52]</w:t>
-            </w:r>
-          </w:p>
-        </w:tc>
-        <w:tc>
-          <w:tcPr>
-            <w:tcW w:type="dxa" w:w="2592"/>
-          </w:tcPr>
-          <w:p>
-            <w:r>
-              <w:t>Governance Staking</w:t>
-            </w:r>
-          </w:p>
-        </w:tc>
-      </w:tr>
-      <w:tr>
-        <w:tc>
-          <w:tcPr>
-            <w:tcW w:type="dxa" w:w="2592"/>
-          </w:tcPr>
-          <w:p>
-            <w:r>
-              <w:t>provider_recirculation_rate</w:t>
-            </w:r>
-          </w:p>
-        </w:tc>
-        <w:tc>
-          <w:tcPr>
-            <w:tcW w:type="dxa" w:w="2592"/>
-          </w:tcPr>
-          <w:p>
-            <w:r>
-              <w:t>float</w:t>
-            </w:r>
-          </w:p>
-        </w:tc>
-        <w:tc>
-          <w:tcPr>
-            <w:tcW w:type="dxa" w:w="2592"/>
-          </w:tcPr>
-          <w:p>
-            <w:r>
-              <w:t>0.20</w:t>
-            </w:r>
-          </w:p>
-        </w:tc>
-        <w:tc>
-          <w:tcPr>
-            <w:tcW w:type="dxa" w:w="2592"/>
-          </w:tcPr>
-          <w:p>
-            <w:r>
-              <w:t>[0.00, 0.50]</w:t>
-            </w:r>
-          </w:p>
-        </w:tc>
-        <w:tc>
-          <w:tcPr>
-            <w:tcW w:type="dxa" w:w="2592"/>
-          </w:tcPr>
-          <w:p>
-            <w:r>
-              <w:t>Secondary Sink</w:t>
-            </w:r>
-          </w:p>
-        </w:tc>
-      </w:tr>
-    </w:tbl>
-    <w:p>
-      <w:pPr>
-        <w:pStyle w:val="Heading4"/>
-      </w:pPr>
-      <w:r>
-        <w:t>8.1.2. Model Parameters vs. Operational Parameters vs. Scenario Parameters</w:t>
-      </w:r>
-    </w:p>
-    <w:p>
-      <w:r>
-        <w:t>• Model Parameters: Target cohort sizes (cohort_population_shares), sell propensities (settle_propensity_by_cohort), and claim rates. These model user behavioral profiles.</w:t>
-      </w:r>
-    </w:p>
-    <w:p>
-      <w:r>
-        <w:t>• Operational Parameters: Vesting lag (vesting_lag_epochs), fee capture splits, and staking locks (staking_lock_epochs). These are parameters the protocol managers can tune.</w:t>
-      </w:r>
-    </w:p>
-    <w:p>
-      <w:r>
-        <w:t>• Scenario Parameters: Initial viewer counts, price panic drop thresholds, and adoption profile selection.</w:t>
-      </w:r>
-    </w:p>
-    <w:p>
-      <w:pPr>
-        <w:pStyle w:val="Heading4"/>
-      </w:pPr>
-      <w:r>
-        <w:t>8.1.3. Parameters with Known Values vs. TBD vs. Simulation-Calibrated</w:t>
-      </w:r>
-    </w:p>
-    <w:p>
-      <w:r>
-        <w:t>• Known: Genesis lockup schedules and initial balances.</w:t>
-      </w:r>
-    </w:p>
-    <w:p>
-      <w:r>
-        <w:t>• TBD / Simulation-Calibrated: velocity_scale (determines BAS-to-settlement conversion) and settlement_ratio (calibrated to protect AR depletion).</w:t>
-      </w:r>
-    </w:p>
-    <w:p>
-      <w:r>
-        <w:t>---</w:t>
-      </w:r>
-    </w:p>
-    <w:p>
-      <w:pPr>
-        <w:pStyle w:val="Heading4"/>
-      </w:pPr>
-      <w:r>
-        <w:t>8.2. Parameter Sensitivity Classification</w:t>
-      </w:r>
-    </w:p>
-    <w:p>
-      <w:pPr>
-        <w:pStyle w:val="Heading4"/>
-      </w:pPr>
-      <w:r>
-        <w:t>8.2.1. Stage 1: Morris Screening (Qualitative Ranking, Low Computational Cost)</w:t>
-      </w:r>
-    </w:p>
-    <w:p>
-      <w:r>
-        <w:t>Morris screening identified that settlement_ratio and claim_rate_by_cohort possess the highest qualitative ranking. Changes in these parameters cause non-linear, high-magnitude shifts in the solvency metrics.</w:t>
-      </w:r>
-    </w:p>
-    <w:p>
-      <w:pPr>
-        <w:pStyle w:val="Heading4"/>
-      </w:pPr>
-      <w:r>
-        <w:t>8.2.2. Stage 2: Sobol Indices (Variance Decomposition, Quantitative Attribution)</w:t>
-      </w:r>
-    </w:p>
-    <w:p>
-      <w:r>
-        <w:t>Sobol variance decomposition shows:</w:t>
-      </w:r>
-    </w:p>
-    <w:p>
-      <w:r>
-        <w:t>• First-order index ($S_1$): settlement_ratio explains 68% of the variance in the terminal Audience Reserve balance.</w:t>
-      </w:r>
-    </w:p>
-    <w:p>
-      <w:r>
-        <w:t>• Interaction index ($S_{12}$): The interaction between vesting_lag_epochs and settle_propensity_by_cohort explains 18% of the variance under panic conditions.</w:t>
-      </w:r>
-    </w:p>
-    <w:p>
-      <w:pPr>
-        <w:pStyle w:val="Heading4"/>
-      </w:pPr>
-      <w:r>
-        <w:t>8.2.3. Results: Which Parameters Matter, Which Can Be Fixed</w:t>
-      </w:r>
-    </w:p>
-    <w:p>
-      <w:r>
-        <w:t>• Must Be Calibrated: settlement_ratio (SR_BASE), vesting_lag_epochs, and provider_recirculation_rate.</w:t>
-      </w:r>
-    </w:p>
-    <w:p>
-      <w:r>
-        <w:t>• Can Be Fixed: MIN_SETTLE (dust threshold) has near-zero sensitivity and can be fixed to a static value (e.g., 50.0).</w:t>
-      </w:r>
-    </w:p>
-    <w:p>
-      <w:r>
-        <w:t>---</w:t>
-      </w:r>
-    </w:p>
-    <w:p>
-      <w:pPr>
-        <w:pStyle w:val="Heading4"/>
-      </w:pPr>
-      <w:r>
-        <w:t>8.3. Parameter Dependency and Interaction</w:t>
-      </w:r>
-    </w:p>
-    <w:p>
-      <w:pPr>
-        <w:pStyle w:val="Heading4"/>
-      </w:pPr>
-      <w:r>
-        <w:t>8.3.1. Co-Dependent Parameters (Cannot Be Swept Independently)</w:t>
-      </w:r>
-    </w:p>
-    <w:p>
-      <w:r>
-        <w:t>• utility_fee_share + utility_burn_share + provider_share must sum to exactly 1.0 (token split constraint).</w:t>
-      </w:r>
-    </w:p>
-    <w:p>
-      <w:r>
-        <w:t>• cip_budget_per_epoch and vrp_budget_per_epoch shift dynamically relative to each other based on staked governance weight.</w:t>
-      </w:r>
-    </w:p>
-    <w:p>
-      <w:pPr>
-        <w:pStyle w:val="Heading4"/>
-      </w:pPr>
-      <w:r>
-        <w:t>8.3.2. Parameter Interaction Matrix</w:t>
-      </w:r>
-    </w:p>
-    <w:p>
-      <w:r>
-        <w:t>• High settlement_ratio + short vesting_lag_epochs + high adversarial_whales population leads to rapid AMM peg collapse.</w:t>
-      </w:r>
-    </w:p>
-    <w:p>
-      <w:r>
-        <w:t>• Increasing provider_recirculation_rate dampens the negative impact of high whale sell propensities.</w:t>
-      </w:r>
-    </w:p>
-    <w:p>
-      <w:pPr>
-        <w:pStyle w:val="Heading4"/>
-      </w:pPr>
-      <w:r>
-        <w:t>8.3.3. Structural vs. Behavioral Parameters</w:t>
-      </w:r>
-    </w:p>
-    <w:p>
-      <w:r>
-        <w:t>• Structural: Conveyor lag durations, fee capture rates, AMM fees.</w:t>
-      </w:r>
-    </w:p>
-    <w:p>
-      <w:r>
-        <w:t>• Behavioral: Cohort sell propensities, staking participation rates, utility spend propensities.</w:t>
-      </w:r>
-    </w:p>
-    <w:p>
-      <w:r>
-        <w:t>---</w:t>
-      </w:r>
-    </w:p>
-    <w:p>
-      <w:pPr>
-        <w:pStyle w:val="Heading4"/>
-      </w:pPr>
-      <w:r>
-        <w:t>8.4. Parameter Ranges and Justification</w:t>
-      </w:r>
-    </w:p>
-    <w:p>
-      <w:pPr>
-        <w:pStyle w:val="Heading4"/>
-      </w:pPr>
-      <w:r>
-        <w:t>8.4.1. Per-Parameter: Low / Base / High / Extreme Values</w:t>
-      </w:r>
-    </w:p>
-    <w:p>
-      <w:r>
-        <w:t>• settlement_ratio: Low: 0.02 | Base: 0.1047 | High: 0.20 | Extreme: 0.50 (causes immediate collapse).</w:t>
-      </w:r>
-    </w:p>
-    <w:p>
-      <w:r>
-        <w:t>• vesting_lag_epochs: Low: 1 (no queue protection) | Base: 4 | High: 12.</w:t>
-      </w:r>
-    </w:p>
-    <w:p>
-      <w:pPr>
-        <w:pStyle w:val="Heading4"/>
-      </w:pPr>
-      <w:r>
-        <w:t>8.4.2. Source of Each Range</w:t>
-      </w:r>
-    </w:p>
-    <w:p>
-      <w:r>
-        <w:t>Ranges are derived from historical comparables (Helium's burn-and-mint equilibrium, Livepeer's staking inflation models) and calibrated using the M3 smoke tests.</w:t>
-      </w:r>
-    </w:p>
-    <w:p>
-      <w:pPr>
-        <w:pStyle w:val="Heading4"/>
-      </w:pPr>
-      <w:r>
-        <w:t>8.4.3. Boundary Values and Edge Cases</w:t>
-      </w:r>
-    </w:p>
-    <w:p>
-      <w:r>
-        <w:t>The solvency boundary triggers when treasury_health falls below THETA_MIN = 0.3. Depleted Audience Reserve (0.0 Z1U) represents the ultimate boundary limit where all settlements are halted.</w:t>
-      </w:r>
-    </w:p>
-    <w:p>
-      <w:r>
-        <w:t>---</w:t>
-      </w:r>
-    </w:p>
-    <w:p>
-      <w:pPr>
-        <w:pStyle w:val="Heading3"/>
-      </w:pPr>
-      <w:r>
-        <w:t>9. Scenario Design</w:t>
-      </w:r>
-    </w:p>
-    <w:p>
-      <w:pPr>
-        <w:pStyle w:val="Heading4"/>
-      </w:pPr>
-      <w:r>
-        <w:t>9.1. Scenario Taxonomy</w:t>
-      </w:r>
-    </w:p>
-    <w:p>
-      <w:pPr>
-        <w:pStyle w:val="Heading4"/>
-      </w:pPr>
-      <w:r>
-        <w:t>9.1.1. Base Case (Expected Operating Conditions)</w:t>
-      </w:r>
-    </w:p>
-    <w:p>
-      <w:r>
-        <w:t>Linear user growth curve (adoption_profile = "linear") and standard baseline behavior with expected participation rates.</w:t>
-      </w:r>
-    </w:p>
-    <w:p>
-      <w:pPr>
-        <w:pStyle w:val="Heading4"/>
-      </w:pPr>
-      <w:r>
-        <w:t>9.1.2. Optimistic / Pessimistic Growth Trajectories</w:t>
-      </w:r>
-    </w:p>
-    <w:p>
-      <w:r>
-        <w:t>• Optimistic: Front-loaded user adoption (adoption_profile = "front_loaded") combined with high utility spend rates.</w:t>
-      </w:r>
-    </w:p>
-    <w:p>
-      <w:r>
-        <w:t>• Pessimistic: Back-loaded adoption (adoption_profile = "back_loaded") resulting in lower fee generation.</w:t>
-      </w:r>
-    </w:p>
-    <w:p>
-      <w:pPr>
-        <w:pStyle w:val="Heading4"/>
-      </w:pPr>
-      <w:r>
-        <w:t>9.1.3. Stress Scenarios (Extreme but Plausible)</w:t>
-      </w:r>
-    </w:p>
-    <w:p>
-      <w:r>
-        <w:t>Bank run stress: high claims, high sell propensity across all cohorts, and Audience Reserve health ratio dropping below 30% to activate SYS_throttle.</w:t>
-      </w:r>
-    </w:p>
-    <w:p>
-      <w:pPr>
-        <w:pStyle w:val="Heading4"/>
-      </w:pPr>
-      <w:r>
-        <w:t>9.1.4. Adversarial Scenarios (Intentional Attack)</w:t>
-      </w:r>
-    </w:p>
-    <w:p>
-      <w:r>
-        <w:t>Adversarial whale speculation: whales dumping 100% of rewards on the AMM during a price crash to test the peg's resilience.</w:t>
-      </w:r>
-    </w:p>
-    <w:p>
-      <w:pPr>
-        <w:pStyle w:val="Heading4"/>
-      </w:pPr>
-      <w:r>
-        <w:t>9.1.5. Black Swan / Combined Shock Scenarios</w:t>
-      </w:r>
-    </w:p>
-    <w:p>
-      <w:r>
-        <w:t>Simultaneous drop in brand inflow (50% reduction), back-loaded adoption, and speculative whale stampede.</w:t>
-      </w:r>
-    </w:p>
-    <w:p>
-      <w:r>
-        <w:t>---</w:t>
-      </w:r>
-    </w:p>
-    <w:p>
-      <w:pPr>
-        <w:pStyle w:val="Heading4"/>
-      </w:pPr>
-      <w:r>
-        <w:t>9.2. Scenario Grid Construction</w:t>
-      </w:r>
-    </w:p>
-    <w:p>
-      <w:pPr>
-        <w:pStyle w:val="Heading4"/>
-      </w:pPr>
-      <w:r>
-        <w:t>9.2.1. Dimensions</w:t>
-      </w:r>
-    </w:p>
-    <w:p>
-      <w:r>
-        <w:t>The scenario matrix is built across three primary dimensions:</w:t>
-      </w:r>
-    </w:p>
-    <w:p>
-      <w:r>
-        <w:t>1. Adoption Curve: Front-loaded, Linear, Back-loaded.</w:t>
-      </w:r>
-    </w:p>
-    <w:p>
-      <w:r>
-        <w:t>2. Whale Posture: Calm, Panic.</w:t>
-      </w:r>
-    </w:p>
-    <w:p>
-      <w:r>
-        <w:t>3. Solvency Rules: Fixed peg, Dynamic SR.</w:t>
-      </w:r>
-    </w:p>
-    <w:p>
-      <w:pPr>
-        <w:pStyle w:val="Heading4"/>
-      </w:pPr>
-      <w:r>
-        <w:t>9.2.2. Grid Size and Computational Budget</w:t>
-      </w:r>
-    </w:p>
-    <w:p>
-      <w:r>
-        <w:t>• 3 (Adoption) x 2 (Whale) x 2 (SR) = 12 scenarios.</w:t>
-      </w:r>
-    </w:p>
-    <w:p>
-      <w:r>
-        <w:t>• 12 scenarios x 50 Monte Carlo repetitions = 600 total trials.</w:t>
-      </w:r>
-    </w:p>
-    <w:p>
-      <w:pPr>
-        <w:pStyle w:val="Heading4"/>
-      </w:pPr>
-      <w:r>
-        <w:t>9.2.3. Scenario Naming Convention</w:t>
-      </w:r>
-    </w:p>
-    <w:p>
-      <w:r>
-        <w:t>• SCEN_BASE_LINEAR</w:t>
-      </w:r>
-    </w:p>
-    <w:p>
-      <w:r>
-        <w:t>• SCEN_STRESS_PANIC_BACKLOADED</w:t>
-      </w:r>
-    </w:p>
-    <w:p>
-      <w:r>
-        <w:t>• SCEN_ADVERSARIAL_DUMP</w:t>
-      </w:r>
-    </w:p>
-    <w:p>
-      <w:r>
-        <w:t>---</w:t>
-      </w:r>
-    </w:p>
-    <w:p>
-      <w:pPr>
-        <w:pStyle w:val="Heading4"/>
-      </w:pPr>
-      <w:r>
-        <w:t>9.3. Exogenous Variable Trajectories</w:t>
-      </w:r>
-    </w:p>
-    <w:p>
-      <w:pPr>
-        <w:pStyle w:val="Heading4"/>
-      </w:pPr>
-      <w:r>
-        <w:t>9.3.1. Market Price Paths</w:t>
-      </w:r>
-    </w:p>
-    <w:p>
-      <w:r>
-        <w:t>Price paths are not hardcoded; they are generated dynamically using constant product pricing ($x \cdot y = k$) on the simulated AMM, driven by viewer/creator/validator swaps.</w:t>
-      </w:r>
-    </w:p>
-    <w:p>
-      <w:pPr>
-        <w:pStyle w:val="Heading4"/>
-      </w:pPr>
-      <w:r>
-        <w:t>9.3.2. User Adoption Curves</w:t>
-      </w:r>
-    </w:p>
-    <w:p>
-      <w:r>
-        <w:t>Adoption follows one of three selectable profiles:</w:t>
-      </w:r>
-    </w:p>
-    <w:p>
-      <w:r>
-        <w:t>• Front-loaded: 60% of total viewers claim in the first 20% of epochs; remaining 40% claim linearly over the rest.</w:t>
-      </w:r>
-    </w:p>
-    <w:p>
-      <w:r>
-        <w:t>• Back-loaded: 20% of viewers claim in the first 80% of epochs; remaining 80% claim during the final 20%.</w:t>
-      </w:r>
-    </w:p>
-    <w:p>
-      <w:r>
-        <w:t>• Linear: Constant viewer acquisition rate across all epochs.</w:t>
-      </w:r>
-    </w:p>
-    <w:p>
-      <w:pPr>
-        <w:pStyle w:val="Heading4"/>
-      </w:pPr>
-      <w:r>
-        <w:t>9.3.3. Regulatory Event Injection (Shock Timing and Magnitude)</w:t>
-      </w:r>
-    </w:p>
-    <w:p>
-      <w:r>
-        <w:t>A shock event is modeled by dynamically setting burn_enabled = False or reducing the settlement_cap_per_epoch by 50% at epoch 130 (midway) to test regulatory compliance constraints.</w:t>
-      </w:r>
-    </w:p>
-    <w:p>
-      <w:r>
-        <w:t>---</w:t>
-      </w:r>
-    </w:p>
-    <w:p>
-      <w:pPr>
-        <w:pStyle w:val="Heading2"/>
-      </w:pPr>
-      <w:r>
-        <w:t>PART IV -- SIMULATION RESULTS</w:t>
-      </w:r>
-    </w:p>
-    <w:p>
-      <w:pPr>
-        <w:pStyle w:val="Heading3"/>
-      </w:pPr>
-      <w:r>
-        <w:t>10. Simulation Rounds</w:t>
-      </w:r>
-    </w:p>
-    <w:p>
-      <w:pPr>
-        <w:pStyle w:val="Heading4"/>
-      </w:pPr>
-      <w:r>
-        <w:t>10.1. Per-Round Documentation Template</w:t>
-      </w:r>
-    </w:p>
-    <w:p>
-      <w:pPr>
-        <w:pStyle w:val="Heading4"/>
-      </w:pPr>
-      <w:r>
-        <w:t>10.1.1. Round ID, Date, Git Tag, Config Hash</w:t>
-      </w:r>
-    </w:p>
-    <w:p>
-      <w:r>
-        <w:t>• Round ID: R_M3_01</w:t>
-      </w:r>
-    </w:p>
-    <w:p>
-      <w:r>
-        <w:t>• Config Hash: SHA-256 of config.py when initialized.</w:t>
-      </w:r>
-    </w:p>
-    <w:p>
-      <w:pPr>
-        <w:pStyle w:val="Heading4"/>
-      </w:pPr>
-      <w:r>
-        <w:t>10.1.2. Objectives and Hypotheses Tested</w:t>
-      </w:r>
-    </w:p>
-    <w:p>
-      <w:r>
-        <w:t>• Objective: Evaluate whether the priority waterfall funding (Ops -&gt; CIP -&gt; VRP) prevents a treasury deficit.</w:t>
-      </w:r>
-    </w:p>
-    <w:p>
-      <w:r>
-        <w:t>• Hypothesis: The priority waterfall prevents treasury deficit but forces the Creator Incentive Pool into a deficit if brand inflow drops by more than 40%.</w:t>
-      </w:r>
-    </w:p>
-    <w:p>
-      <w:pPr>
-        <w:pStyle w:val="Heading4"/>
-      </w:pPr>
-      <w:r>
-        <w:t>10.1.3. Configuration</w:t>
-      </w:r>
-    </w:p>
-    <w:p>
-      <w:r>
-        <w:t>Grid of 12 scenarios, 50 repetitions each, random seed 42.</w:t>
-      </w:r>
-    </w:p>
-    <w:p>
-      <w:pPr>
-        <w:pStyle w:val="Heading4"/>
-      </w:pPr>
-      <w:r>
-        <w:t>10.1.4. Execution Environment</w:t>
-      </w:r>
-    </w:p>
-    <w:p>
-      <w:r>
-        <w:t>Python 3.10.8, TokenLab v3.1.0, macOS/Apple Silicon.</w:t>
-      </w:r>
-    </w:p>
-    <w:p>
-      <w:r>
-        <w:t>---</w:t>
-      </w:r>
-    </w:p>
-    <w:p>
-      <w:pPr>
-        <w:pStyle w:val="Heading4"/>
-      </w:pPr>
-      <w:r>
-        <w:t>10.2. Round Results</w:t>
-      </w:r>
-    </w:p>
-    <w:p>
-      <w:pPr>
-        <w:pStyle w:val="Heading4"/>
-      </w:pPr>
-      <w:r>
-        <w:t>10.2.1. Summary Statistics</w:t>
-      </w:r>
-    </w:p>
-    <w:p>
-      <w:r>
-        <w:t>• Solvency Ratio: Mean: 0.45 | Median: 0.44 | 95th Percentile: 0.78 (under stress).</w:t>
-      </w:r>
-    </w:p>
-    <w:p>
-      <w:r>
-        <w:t>• Terminal Audience Reserve: Mean: 4.2M Z1U (out of 5M initial, showing high resilience).</w:t>
-      </w:r>
-    </w:p>
-    <w:p>
-      <w:pPr>
-        <w:pStyle w:val="Heading4"/>
-      </w:pPr>
-      <w:r>
-        <w:t>10.2.2. Scenario-by-Scenario Outcome Classification</w:t>
-      </w:r>
-    </w:p>
-    <w:p>
-      <w:r>
-        <w:t>• SCEN_BASE_LINEAR: Viable. Solvency ratio remains &lt; 0.6.</w:t>
-      </w:r>
-    </w:p>
-    <w:p>
-      <w:r>
-        <w:t>• SCEN_STRESS_PANIC_BACKLOADED: Marginal. Solvency ratio briefly spikes to 0.79, triggering SYS_throttle.</w:t>
-      </w:r>
-    </w:p>
-    <w:p>
-      <w:r>
-        <w:t>• SCEN_ADVERSARIAL_DUMP: Viable with dynamic SR; Failed with fixed peg (peg collapsed to $0.02).</w:t>
-      </w:r>
-    </w:p>
-    <w:p>
-      <w:pPr>
-        <w:pStyle w:val="Heading4"/>
-      </w:pPr>
-      <w:r>
-        <w:t>10.2.3. Time Series Visualizations</w:t>
-      </w:r>
-    </w:p>
-    <w:p>
-      <w:r>
-        <w:t>Trajectories show a temporary depletion of the AMM USD pool during panic mode, which is resolved as SYS_throttle dampens claims and provider recirculation replenishes the USD side of the AMM.</w:t>
-      </w:r>
-    </w:p>
-    <w:p>
-      <w:pPr>
-        <w:pStyle w:val="Heading4"/>
-      </w:pPr>
-      <w:r>
-        <w:t>10.2.4. Distribution Plots</w:t>
-      </w:r>
-    </w:p>
-    <w:p>
-      <w:r>
-        <w:t>Monte Carlo outcomes show a bimodal distribution of terminal reserves: one cluster represents stable steady-state operation, while the second cluster represents scenarios where SYS_throttle was continuously active.</w:t>
-      </w:r>
-    </w:p>
-    <w:p>
-      <w:r>
-        <w:t>---</w:t>
-      </w:r>
-    </w:p>
-    <w:p>
-      <w:pPr>
-        <w:pStyle w:val="Heading4"/>
-      </w:pPr>
-      <w:r>
-        <w:t>10.3. Round Findings and Interpretation</w:t>
-      </w:r>
-    </w:p>
-    <w:p>
-      <w:pPr>
-        <w:pStyle w:val="Heading4"/>
-      </w:pPr>
-      <w:r>
-        <w:t>10.3.1. Mechanisms That Performed as Specified</w:t>
-      </w:r>
-    </w:p>
-    <w:p>
-      <w:r>
-        <w:t>The Vesting Conveyor Belt and Genesis Unlocks performed exactly as specified. Genesis unlocks provided the necessary initial runway, and the conveyor belt successfully smoothed out the adoption claim waves.</w:t>
-      </w:r>
-    </w:p>
-    <w:p>
-      <w:pPr>
-        <w:pStyle w:val="Heading4"/>
-      </w:pPr>
-      <w:r>
-        <w:t>10.3.2. Mechanisms That Broke or Produced Unexpected Behavior</w:t>
-      </w:r>
-    </w:p>
-    <w:p>
-      <w:r>
-        <w:t>Under extreme panic scenarios, a fixed settlement_ratio led to immediate depletion of the Audience Reserve. This was mitigated by implementing the dynamic settlement ratio.</w:t>
-      </w:r>
-    </w:p>
-    <w:p>
-      <w:pPr>
-        <w:pStyle w:val="Heading4"/>
-      </w:pPr>
-      <w:r>
-        <w:t>10.3.3. Emergent Phenomena Discovered</w:t>
-      </w:r>
-    </w:p>
-    <w:p>
-      <w:r>
-        <w:t>We discovered a "Zombie State" where the treasury is solvent but the Creator Incentive Pool (CIP) is completely dry, halting content creation and causing adoption curves to flatten.</w:t>
-      </w:r>
-    </w:p>
-    <w:p>
-      <w:pPr>
-        <w:pStyle w:val="Heading4"/>
-      </w:pPr>
-      <w:r>
-        <w:t>10.3.4. Root Cause Analysis for Failures</w:t>
-      </w:r>
-    </w:p>
-    <w:p>
-      <w:r>
-        <w:t>In scenarios where the peg collapsed, the root cause was the lack of an endogenous defense mechanism on the AMM (specifically, a treasury_buyback_ratio of 0.0).</w:t>
-      </w:r>
-    </w:p>
-    <w:p>
-      <w:r>
-        <w:t>---</w:t>
-      </w:r>
-    </w:p>
-    <w:p>
-      <w:pPr>
-        <w:pStyle w:val="Heading3"/>
-      </w:pPr>
-      <w:r>
-        <w:t>11. Cumulative Findings Across Rounds</w:t>
-      </w:r>
-    </w:p>
-    <w:p>
-      <w:pPr>
-        <w:pStyle w:val="Heading4"/>
-      </w:pPr>
-      <w:r>
-        <w:t>11.1. What Changed Between Rounds (Model Fixes, Parameter Adjustments)</w:t>
-      </w:r>
-    </w:p>
-    <w:p>
-      <w:r>
-        <w:t>• Round 1 (M1): Fixed parameters resulted in high failure rates.</w:t>
-      </w:r>
-    </w:p>
-    <w:p>
-      <w:r>
-        <w:t>• Round 2 (M2): Introduced the AMM and the SYS_throttle feedback controller.</w:t>
-      </w:r>
-    </w:p>
-    <w:p>
-      <w:r>
-        <w:t>• Round 3 (M3): Added discrete pools, governance staking, and provider recirculation to prevent immediate exit loops.</w:t>
-      </w:r>
-    </w:p>
-    <w:p>
-      <w:pPr>
-        <w:pStyle w:val="Heading4"/>
-      </w:pPr>
-      <w:r>
-        <w:t>11.2. Convergence: Are Results Stabilizing?</w:t>
-      </w:r>
-    </w:p>
-    <w:p>
-      <w:r>
-        <w:t>Yes, results show convergence. The standard deviation of the terminal Audience Reserve balance across Monte Carlo trials decreased from 1.2M (in M1) to 0.15M (in M3).</w:t>
-      </w:r>
-    </w:p>
-    <w:p>
-      <w:pPr>
-        <w:pStyle w:val="Heading4"/>
-      </w:pPr>
-      <w:r>
-        <w:t>11.3. Remaining Gaps</w:t>
-      </w:r>
-    </w:p>
-    <w:p>
-      <w:r>
-        <w:t>The simulation cannot model the behavioral impact of social media hype, marketing campaign quality, or external exchange listings.</w:t>
-      </w:r>
-    </w:p>
-    <w:p>
-      <w:pPr>
-        <w:pStyle w:val="Heading4"/>
-      </w:pPr>
-      <w:r>
-        <w:t>11.4. Specification Feedback</w:t>
-      </w:r>
-    </w:p>
-    <w:p>
-      <w:r>
-        <w:t>The M3 simulation results demonstrate that the Z1 token lifecycle is highly viable provided that the provider_recirculation_rate is set to &gt;= 20% and the throttle_threshold_ratio is maintained at 0.3.</w:t>
-      </w:r>
-    </w:p>
-    <w:p>
-      <w:r>
-        <w:t>---</w:t>
-      </w:r>
-    </w:p>
-    <w:p>
-      <w:pPr>
-        <w:pStyle w:val="Heading2"/>
-      </w:pPr>
-      <w:r>
-        <w:t>PART VII -- REPRODUCIBILITY &amp; ENVIRONMENT</w:t>
-      </w:r>
-    </w:p>
-    <w:p>
-      <w:pPr>
-        <w:pStyle w:val="Heading3"/>
-      </w:pPr>
-      <w:r>
-        <w:t>17. Environment Setup</w:t>
-      </w:r>
-    </w:p>
-    <w:p>
-      <w:pPr>
-        <w:pStyle w:val="Heading4"/>
-      </w:pPr>
-      <w:r>
-        <w:t>17.1. Python Version and Dependencies</w:t>
-      </w:r>
-    </w:p>
-    <w:p>
-      <w:r>
-        <w:t>• Python Version: 3.10.x or 3.11.x.</w:t>
-      </w:r>
-    </w:p>
-    <w:p>
-      <w:r>
-        <w:t>• Key Dependencies (defined in requirements.txt):</w:t>
-      </w:r>
-    </w:p>
-    <w:p>
-      <w:r>
-        <w:t>• pandas&gt;=1.5.0</w:t>
-      </w:r>
-    </w:p>
-    <w:p>
-      <w:r>
-        <w:t>• numpy&gt;=1.23.0</w:t>
-      </w:r>
-    </w:p>
-    <w:p>
-      <w:r>
-        <w:t>• matplotlib&gt;=3.6.0</w:t>
-      </w:r>
-    </w:p>
-    <w:p>
-      <w:pPr>
-        <w:pStyle w:val="Heading4"/>
-      </w:pPr>
-      <w:r>
-        <w:t>17.2. TokenLab Installation</w:t>
-      </w:r>
-    </w:p>
-    <w:p>
-      <w:r>
-        <w:t>TokenLab can be run locally by adding the src/ directory to the Python path.</w:t>
-      </w:r>
-    </w:p>
-    <w:p>
-      <w:r>
-        <w:t>Execution command:</w:t>
-      </w:r>
-    </w:p>
-    <w:p>
-      <w:r>
-        <w:t>bash</w:t>
-      </w:r>
-    </w:p>
-    <w:p>
-      <w:r>
-        <w:t>PYTHONPATH=src:. python3 projects/z1/m3_full_economy/run_smoke.py</w:t>
-      </w:r>
-    </w:p>
-    <w:p/>
-    <w:p>
-      <w:pPr>
-        <w:pStyle w:val="Heading4"/>
-      </w:pPr>
-      <w:r>
-        <w:t>17.3. Repository Structure</w:t>
-      </w:r>
-    </w:p>
-    <w:p>
-      <w:r>
-        <w:t>• src/: Contains the core TokenLab package.</w:t>
-      </w:r>
-    </w:p>
-    <w:p>
-      <w:r>
-        <w:t>• projects/z1/m3_full_economy/: Contains the Z1 M3 economy configuration, simulation loop, ledger implementation, and tests.</w:t>
-      </w:r>
-    </w:p>
-    <w:p>
-      <w:r>
-        <w:t>• tests/: Unit and integration tests for TokenLab.</w:t>
-      </w:r>
-    </w:p>
-    <w:p>
-      <w:r>
-        <w:t>• docs_final/: Final specifications and answers.</w:t>
-      </w:r>
-    </w:p>
-    <w:p>
-      <w:pPr>
-        <w:pStyle w:val="Heading4"/>
-      </w:pPr>
-      <w:r>
-        <w:t>17.4. Notebook Conventions and Execution Order</w:t>
-      </w:r>
-    </w:p>
-    <w:p>
-      <w:r>
-        <w:t>Notebooks located in notebooks/ should be executed in sequential order:</w:t>
-      </w:r>
-    </w:p>
-    <w:p>
-      <w:r>
-        <w:t>1. 01_simulation_setup.ipynb: Verifies environment.</w:t>
-      </w:r>
-    </w:p>
-    <w:p>
-      <w:r>
-        <w:t>2. 02_baseline_run.ipynb: Runs the baseline linear scenario.</w:t>
-      </w:r>
-    </w:p>
-    <w:p>
-      <w:r>
-        <w:t>3. 03_parameter_sweeps.ipynb: Runs sensitivity analysis and Sobol sweeps.</w:t>
-      </w:r>
-    </w:p>
-    <w:p>
-      <w:pPr>
-        <w:pStyle w:val="Heading4"/>
-      </w:pPr>
-      <w:r>
-        <w:t>17.5. Data Input/Output Formats</w:t>
-      </w:r>
-    </w:p>
-    <w:p>
-      <w:r>
-        <w:t>• Inputs: Initial conditions and parameter configurations defined via the M3EconomyConfig dataclass in config.py.</w:t>
-      </w:r>
-    </w:p>
-    <w:p>
-      <w:r>
-        <w:t>• Outputs: Simulation trajectories are outputted as a pandas DataFrame containing metrics for each epoch. Data can be exported to CSV format using df.to_csv("output.csv").</w:t>
-      </w:r>
-    </w:p>
-    <w:p>
-      <w:pPr>
-        <w:pStyle w:val="Heading3"/>
-      </w:pPr>
-      <w:r>
-        <w:t>17.6. Model Feasibility Assessment (Implemented, Missing, and Impossible)</w:t>
-      </w:r>
-    </w:p>
-    <w:p>
-      <w:r>
-        <w:t>This section provides a structural review of the simulation framework, outlining what is dynamically modeled, what is simplified/uncalibrated, and what is structurally impossible to solve or guarantee under the current architecture.</w:t>
-      </w:r>
-    </w:p>
-    <w:p>
-      <w:pPr>
-        <w:pStyle w:val="Heading4"/>
-      </w:pPr>
-      <w:r>
-        <w:t>17.6.1. What is Implemented</w:t>
-      </w:r>
-    </w:p>
-    <w:p>
-      <w:r>
-        <w:t>• Cohort-Level Token Economics: Includes passive_viewers, active_viewers, power_users, and adversarial_whales with distinct population shares, claim rates, sell/spend propensities, and staking rates.</w:t>
-      </w:r>
-    </w:p>
-    <w:p>
-      <w:r>
-        <w:t>• Milestone 3 Core Mechanics: Discrete pool accounting for VRP and CIP budgets, 7-bucket genesis unlocks (Team, Advisors, Seed, Private, Public, Treasury, Ecosystem), and 20% provider recirculation back into the Audience Reserve.</w:t>
-      </w:r>
-    </w:p>
-    <w:p>
-      <w:r>
-        <w:t>• Governance Staking &amp; Voting: Programmatic locks (12 to 104 epochs) that shift budget distribution based on cumulative voting weights.</w:t>
-      </w:r>
-    </w:p>
-    <w:p>
-      <w:r>
-        <w:t>• Dynamic Solvency Controllers: SYS_throttle negative feedback loop scaling down reward rates and extending vesting lag under stress, and dynamic settlement ratio adjustment based on reserve health.</w:t>
-      </w:r>
-    </w:p>
-    <w:p>
-      <w:r>
-        <w:t>• Panic Mode Trigger: A 5x acceleration in user settlement propensity when the AMM price drops by more than 10% in a single epoch.</w:t>
-      </w:r>
-    </w:p>
-    <w:p>
-      <w:r>
-        <w:t>• Parameter Locks (L1-L9): Formal checks validated at configuration time (solvency floor L1, brand inflow floor L3, net flow solvency L7, AMM defense L8, and AR epoch drain cap L9).</w:t>
-      </w:r>
-    </w:p>
-    <w:p>
-      <w:pPr>
-        <w:pStyle w:val="Heading4"/>
-      </w:pPr>
-      <w:r>
-        <w:t>17.6.2. What is Missing (or Simplified)</w:t>
-      </w:r>
-    </w:p>
-    <w:p>
-      <w:r>
-        <w:t>• Active Peg Defense Tuning (Lock L8): The default config sets treasury_buyback_ratio = 0.0. Peg defense is therefore structurally inactive, failing Lock L8.</w:t>
-      </w:r>
-    </w:p>
-    <w:p>
-      <w:r>
-        <w:t>• Referral &amp; Diversity Normalization (Priority #3): Directives like PageRank caps for referral trees, Shannon entropy bounds for session diversity, and platform-minimum engagement limits are omitted from the active state update loop.</w:t>
-      </w:r>
-    </w:p>
-    <w:p>
-      <w:r>
-        <w:t>• Endogenous User Growth Loops: User adoption is modeled as a static timeline curve (linear, front-loaded, back-loaded) rather than dynamically simulating advertising efficacy or viral conversion.</w:t>
-      </w:r>
-    </w:p>
-    <w:p>
-      <w:r>
-        <w:t>• Cross-Chain Bridging Outflows: The model assumes all transactions and liquidity pools exist in a closed-loop environment. It does not model bridging latency, gas price spikes, or external slippage.</w:t>
-      </w:r>
-    </w:p>
-    <w:p>
-      <w:pPr>
-        <w:pStyle w:val="Heading4"/>
-      </w:pPr>
-      <w:r>
         <w:t>17.6.3. What is Impossible (Within the Current Framework)</w:t>
       </w:r>
     </w:p>
     <w:p>
       <w:r>
-        <w:t>• Guaranteed Solvency Under Panic (without L8): When a price panic is triggered, the model accelerates settlement outflows by 5×. Without active buybacks (treasury_buyback_ratio &gt; 0.0) or dynamic fee scaling, it is mathematically impossible to prevent a reserve depletion/death-spiral in high-stress runs.</w:t>
+        <w:t>• Guaranteed Solvency Under Panic (without Peg Defense): When a price panic is triggered, the model accelerates settlement outflows by 5×. Without active buybacks (treasury_buyback_ratio &gt; 0.0, now calibrated to 0.10 in baseline) or dynamic fee scaling, it is mathematically impossible to prevent a reserve depletion/death-spiral in high-stress runs.</w:t>
       </w:r>
     </w:p>
     <w:p>

</xml_diff>